<commit_message>
Update MediBridge report and exclude oversized lecture archives
</commit_message>
<xml_diff>
--- a/8주차/Agile_MSA_개인보고서_MediBridge_보고서형_수정본.docx
+++ b/8주차/Agile_MSA_개인보고서_MediBridge_보고서형_수정본.docx
@@ -117,7 +117,7 @@
           </w:tcPr>
           <w:p>
             <w:pPr>
-              <w:spacing w:after="40" w:before="40" w:line="283" w:lineRule="auto"/>
+              <w:spacing w:after="40" w:before="40" w:line="260" w:lineRule="exact"/>
               <w:jc w:val="center"/>
             </w:pPr>
             <w:r>
@@ -149,7 +149,7 @@
           </w:tcPr>
           <w:p>
             <w:pPr>
-              <w:spacing w:after="40" w:before="40" w:line="283" w:lineRule="auto"/>
+              <w:spacing w:after="40" w:before="40" w:line="260" w:lineRule="exact"/>
               <w:jc w:val="center"/>
             </w:pPr>
             <w:r>
@@ -181,7 +181,7 @@
           </w:tcPr>
           <w:p>
             <w:pPr>
-              <w:spacing w:after="40" w:before="40" w:line="283" w:lineRule="auto"/>
+              <w:spacing w:after="40" w:before="40" w:line="260" w:lineRule="exact"/>
               <w:jc w:val="center"/>
             </w:pPr>
             <w:r>
@@ -217,7 +217,7 @@
           </w:tcPr>
           <w:p>
             <w:pPr>
-              <w:spacing w:after="40" w:before="40" w:line="283" w:lineRule="auto"/>
+              <w:spacing w:after="40" w:before="40" w:line="260" w:lineRule="exact"/>
               <w:jc w:val="center"/>
             </w:pPr>
             <w:r>
@@ -248,7 +248,7 @@
           </w:tcPr>
           <w:p>
             <w:pPr>
-              <w:spacing w:after="40" w:before="40" w:line="283" w:lineRule="auto"/>
+              <w:spacing w:after="40" w:before="40" w:line="260" w:lineRule="exact"/>
               <w:jc w:val="left"/>
             </w:pPr>
             <w:r>
@@ -279,7 +279,7 @@
           </w:tcPr>
           <w:p>
             <w:pPr>
-              <w:spacing w:after="40" w:before="40" w:line="283" w:lineRule="auto"/>
+              <w:spacing w:after="40" w:before="40" w:line="260" w:lineRule="exact"/>
               <w:jc w:val="left"/>
             </w:pPr>
             <w:r>
@@ -315,7 +315,7 @@
           </w:tcPr>
           <w:p>
             <w:pPr>
-              <w:spacing w:after="40" w:before="40" w:line="283" w:lineRule="auto"/>
+              <w:spacing w:after="40" w:before="40" w:line="260" w:lineRule="exact"/>
               <w:jc w:val="center"/>
             </w:pPr>
             <w:r>
@@ -346,7 +346,7 @@
           </w:tcPr>
           <w:p>
             <w:pPr>
-              <w:spacing w:after="40" w:before="40" w:line="283" w:lineRule="auto"/>
+              <w:spacing w:after="40" w:before="40" w:line="260" w:lineRule="exact"/>
               <w:jc w:val="left"/>
             </w:pPr>
             <w:r>
@@ -377,7 +377,7 @@
           </w:tcPr>
           <w:p>
             <w:pPr>
-              <w:spacing w:after="40" w:before="40" w:line="283" w:lineRule="auto"/>
+              <w:spacing w:after="40" w:before="40" w:line="260" w:lineRule="exact"/>
               <w:jc w:val="left"/>
             </w:pPr>
             <w:r>
@@ -413,7 +413,7 @@
           </w:tcPr>
           <w:p>
             <w:pPr>
-              <w:spacing w:after="40" w:before="40" w:line="283" w:lineRule="auto"/>
+              <w:spacing w:after="40" w:before="40" w:line="260" w:lineRule="exact"/>
               <w:jc w:val="center"/>
             </w:pPr>
             <w:r>
@@ -444,7 +444,7 @@
           </w:tcPr>
           <w:p>
             <w:pPr>
-              <w:spacing w:after="40" w:before="40" w:line="283" w:lineRule="auto"/>
+              <w:spacing w:after="40" w:before="40" w:line="260" w:lineRule="exact"/>
               <w:jc w:val="left"/>
             </w:pPr>
             <w:r>
@@ -475,7 +475,7 @@
           </w:tcPr>
           <w:p>
             <w:pPr>
-              <w:spacing w:after="40" w:before="40" w:line="283" w:lineRule="auto"/>
+              <w:spacing w:after="40" w:before="40" w:line="260" w:lineRule="exact"/>
               <w:jc w:val="left"/>
             </w:pPr>
             <w:r>
@@ -506,13 +506,9 @@
       </w:r>
     </w:p>
     <w:p>
-      <w:r>
-        <w:br w:type="page"/>
-      </w:r>
-    </w:p>
-    <w:p>
       <w:pPr>
         <w:pStyle w:val="Heading1"/>
+        <w:pageBreakBefore/>
       </w:pPr>
       <w:r>
         <w:t>1 이해관계자 가치와 업무 문제</w:t>
@@ -563,7 +559,7 @@
           </w:tcPr>
           <w:p>
             <w:pPr>
-              <w:spacing w:after="40" w:before="40" w:line="283" w:lineRule="auto"/>
+              <w:spacing w:after="40" w:before="40" w:line="260" w:lineRule="exact"/>
               <w:jc w:val="center"/>
             </w:pPr>
             <w:r>
@@ -595,7 +591,7 @@
           </w:tcPr>
           <w:p>
             <w:pPr>
-              <w:spacing w:after="40" w:before="40" w:line="283" w:lineRule="auto"/>
+              <w:spacing w:after="40" w:before="40" w:line="260" w:lineRule="exact"/>
               <w:jc w:val="center"/>
             </w:pPr>
             <w:r>
@@ -627,7 +623,7 @@
           </w:tcPr>
           <w:p>
             <w:pPr>
-              <w:spacing w:after="40" w:before="40" w:line="283" w:lineRule="auto"/>
+              <w:spacing w:after="40" w:before="40" w:line="260" w:lineRule="exact"/>
               <w:jc w:val="center"/>
             </w:pPr>
             <w:r>
@@ -663,7 +659,7 @@
           </w:tcPr>
           <w:p>
             <w:pPr>
-              <w:spacing w:after="40" w:before="40" w:line="283" w:lineRule="auto"/>
+              <w:spacing w:after="40" w:before="40" w:line="260" w:lineRule="exact"/>
               <w:jc w:val="center"/>
             </w:pPr>
             <w:r>
@@ -696,7 +692,7 @@
           </w:tcPr>
           <w:p>
             <w:pPr>
-              <w:spacing w:after="40" w:before="40" w:line="283" w:lineRule="auto"/>
+              <w:spacing w:after="40" w:before="40" w:line="260" w:lineRule="exact"/>
               <w:jc w:val="left"/>
             </w:pPr>
             <w:r>
@@ -727,7 +723,7 @@
           </w:tcPr>
           <w:p>
             <w:pPr>
-              <w:spacing w:after="40" w:before="40" w:line="283" w:lineRule="auto"/>
+              <w:spacing w:after="40" w:before="40" w:line="260" w:lineRule="exact"/>
               <w:jc w:val="left"/>
             </w:pPr>
             <w:r>
@@ -763,7 +759,7 @@
           </w:tcPr>
           <w:p>
             <w:pPr>
-              <w:spacing w:after="40" w:before="40" w:line="283" w:lineRule="auto"/>
+              <w:spacing w:after="40" w:before="40" w:line="260" w:lineRule="exact"/>
               <w:jc w:val="center"/>
             </w:pPr>
             <w:r>
@@ -796,7 +792,7 @@
           </w:tcPr>
           <w:p>
             <w:pPr>
-              <w:spacing w:after="40" w:before="40" w:line="283" w:lineRule="auto"/>
+              <w:spacing w:after="40" w:before="40" w:line="260" w:lineRule="exact"/>
               <w:jc w:val="left"/>
             </w:pPr>
             <w:r>
@@ -827,7 +823,7 @@
           </w:tcPr>
           <w:p>
             <w:pPr>
-              <w:spacing w:after="40" w:before="40" w:line="283" w:lineRule="auto"/>
+              <w:spacing w:after="40" w:before="40" w:line="260" w:lineRule="exact"/>
               <w:jc w:val="left"/>
             </w:pPr>
             <w:r>
@@ -863,7 +859,7 @@
           </w:tcPr>
           <w:p>
             <w:pPr>
-              <w:spacing w:after="40" w:before="40" w:line="283" w:lineRule="auto"/>
+              <w:spacing w:after="40" w:before="40" w:line="260" w:lineRule="exact"/>
               <w:jc w:val="center"/>
             </w:pPr>
             <w:r>
@@ -894,7 +890,7 @@
           </w:tcPr>
           <w:p>
             <w:pPr>
-              <w:spacing w:after="40" w:before="40" w:line="283" w:lineRule="auto"/>
+              <w:spacing w:after="40" w:before="40" w:line="260" w:lineRule="exact"/>
               <w:jc w:val="left"/>
             </w:pPr>
             <w:r>
@@ -925,7 +921,7 @@
           </w:tcPr>
           <w:p>
             <w:pPr>
-              <w:spacing w:after="40" w:before="40" w:line="283" w:lineRule="auto"/>
+              <w:spacing w:after="40" w:before="40" w:line="260" w:lineRule="exact"/>
               <w:jc w:val="left"/>
             </w:pPr>
             <w:r>
@@ -961,7 +957,7 @@
           </w:tcPr>
           <w:p>
             <w:pPr>
-              <w:spacing w:after="40" w:before="40" w:line="283" w:lineRule="auto"/>
+              <w:spacing w:after="40" w:before="40" w:line="260" w:lineRule="exact"/>
               <w:jc w:val="center"/>
             </w:pPr>
             <w:r>
@@ -994,7 +990,7 @@
           </w:tcPr>
           <w:p>
             <w:pPr>
-              <w:spacing w:after="40" w:before="40" w:line="283" w:lineRule="auto"/>
+              <w:spacing w:after="40" w:before="40" w:line="260" w:lineRule="exact"/>
               <w:jc w:val="left"/>
             </w:pPr>
             <w:r>
@@ -1025,7 +1021,7 @@
           </w:tcPr>
           <w:p>
             <w:pPr>
-              <w:spacing w:after="40" w:before="40" w:line="283" w:lineRule="auto"/>
+              <w:spacing w:after="40" w:before="40" w:line="260" w:lineRule="exact"/>
               <w:jc w:val="left"/>
             </w:pPr>
             <w:r>
@@ -1107,13 +1103,9 @@
       </w:r>
     </w:p>
     <w:p>
-      <w:r>
-        <w:br w:type="page"/>
-      </w:r>
-    </w:p>
-    <w:p>
       <w:pPr>
         <w:pStyle w:val="Heading1"/>
+        <w:pageBreakBefore/>
       </w:pPr>
       <w:r>
         <w:t>2 추천 기능과 사용자 흐름</w:t>
@@ -1174,7 +1166,7 @@
           </w:tcPr>
           <w:p>
             <w:pPr>
-              <w:spacing w:after="40" w:before="40" w:line="283" w:lineRule="auto"/>
+              <w:spacing w:after="40" w:before="40" w:line="260" w:lineRule="exact"/>
               <w:jc w:val="center"/>
             </w:pPr>
             <w:r>
@@ -1206,7 +1198,7 @@
           </w:tcPr>
           <w:p>
             <w:pPr>
-              <w:spacing w:after="40" w:before="40" w:line="283" w:lineRule="auto"/>
+              <w:spacing w:after="40" w:before="40" w:line="260" w:lineRule="exact"/>
               <w:jc w:val="center"/>
             </w:pPr>
             <w:r>
@@ -1238,7 +1230,7 @@
           </w:tcPr>
           <w:p>
             <w:pPr>
-              <w:spacing w:after="40" w:before="40" w:line="283" w:lineRule="auto"/>
+              <w:spacing w:after="40" w:before="40" w:line="260" w:lineRule="exact"/>
               <w:jc w:val="center"/>
             </w:pPr>
             <w:r>
@@ -1270,7 +1262,7 @@
           </w:tcPr>
           <w:p>
             <w:pPr>
-              <w:spacing w:after="40" w:before="40" w:line="283" w:lineRule="auto"/>
+              <w:spacing w:after="40" w:before="40" w:line="260" w:lineRule="exact"/>
               <w:jc w:val="center"/>
             </w:pPr>
             <w:r>
@@ -1306,7 +1298,7 @@
           </w:tcPr>
           <w:p>
             <w:pPr>
-              <w:spacing w:after="40" w:before="40" w:line="283" w:lineRule="auto"/>
+              <w:spacing w:after="40" w:before="40" w:line="260" w:lineRule="exact"/>
               <w:jc w:val="center"/>
             </w:pPr>
             <w:r>
@@ -1337,7 +1329,7 @@
           </w:tcPr>
           <w:p>
             <w:pPr>
-              <w:spacing w:after="40" w:before="40" w:line="283" w:lineRule="auto"/>
+              <w:spacing w:after="40" w:before="40" w:line="260" w:lineRule="exact"/>
               <w:jc w:val="left"/>
             </w:pPr>
             <w:r>
@@ -1368,7 +1360,7 @@
           </w:tcPr>
           <w:p>
             <w:pPr>
-              <w:spacing w:after="40" w:before="40" w:line="283" w:lineRule="auto"/>
+              <w:spacing w:after="40" w:before="40" w:line="260" w:lineRule="exact"/>
               <w:jc w:val="left"/>
             </w:pPr>
             <w:r>
@@ -1399,7 +1391,7 @@
           </w:tcPr>
           <w:p>
             <w:pPr>
-              <w:spacing w:after="40" w:before="40" w:line="283" w:lineRule="auto"/>
+              <w:spacing w:after="40" w:before="40" w:line="260" w:lineRule="exact"/>
               <w:jc w:val="left"/>
             </w:pPr>
             <w:r>
@@ -1435,7 +1427,7 @@
           </w:tcPr>
           <w:p>
             <w:pPr>
-              <w:spacing w:after="40" w:before="40" w:line="283" w:lineRule="auto"/>
+              <w:spacing w:after="40" w:before="40" w:line="260" w:lineRule="exact"/>
               <w:jc w:val="center"/>
             </w:pPr>
             <w:r>
@@ -1466,7 +1458,7 @@
           </w:tcPr>
           <w:p>
             <w:pPr>
-              <w:spacing w:after="40" w:before="40" w:line="283" w:lineRule="auto"/>
+              <w:spacing w:after="40" w:before="40" w:line="260" w:lineRule="exact"/>
               <w:jc w:val="left"/>
             </w:pPr>
             <w:r>
@@ -1497,7 +1489,7 @@
           </w:tcPr>
           <w:p>
             <w:pPr>
-              <w:spacing w:after="40" w:before="40" w:line="283" w:lineRule="auto"/>
+              <w:spacing w:after="40" w:before="40" w:line="260" w:lineRule="exact"/>
               <w:jc w:val="left"/>
             </w:pPr>
             <w:r>
@@ -1528,7 +1520,7 @@
           </w:tcPr>
           <w:p>
             <w:pPr>
-              <w:spacing w:after="40" w:before="40" w:line="283" w:lineRule="auto"/>
+              <w:spacing w:after="40" w:before="40" w:line="260" w:lineRule="exact"/>
               <w:jc w:val="left"/>
             </w:pPr>
             <w:r>
@@ -1564,7 +1556,7 @@
           </w:tcPr>
           <w:p>
             <w:pPr>
-              <w:spacing w:after="40" w:before="40" w:line="283" w:lineRule="auto"/>
+              <w:spacing w:after="40" w:before="40" w:line="260" w:lineRule="exact"/>
               <w:jc w:val="center"/>
             </w:pPr>
             <w:r>
@@ -1595,7 +1587,7 @@
           </w:tcPr>
           <w:p>
             <w:pPr>
-              <w:spacing w:after="40" w:before="40" w:line="283" w:lineRule="auto"/>
+              <w:spacing w:after="40" w:before="40" w:line="260" w:lineRule="exact"/>
               <w:jc w:val="left"/>
             </w:pPr>
             <w:r>
@@ -1626,7 +1618,7 @@
           </w:tcPr>
           <w:p>
             <w:pPr>
-              <w:spacing w:after="40" w:before="40" w:line="283" w:lineRule="auto"/>
+              <w:spacing w:after="40" w:before="40" w:line="260" w:lineRule="exact"/>
               <w:jc w:val="left"/>
             </w:pPr>
             <w:r>
@@ -1657,7 +1649,7 @@
           </w:tcPr>
           <w:p>
             <w:pPr>
-              <w:spacing w:after="40" w:before="40" w:line="283" w:lineRule="auto"/>
+              <w:spacing w:after="40" w:before="40" w:line="260" w:lineRule="exact"/>
               <w:jc w:val="left"/>
             </w:pPr>
             <w:r>
@@ -1693,7 +1685,7 @@
           </w:tcPr>
           <w:p>
             <w:pPr>
-              <w:spacing w:after="40" w:before="40" w:line="283" w:lineRule="auto"/>
+              <w:spacing w:after="40" w:before="40" w:line="260" w:lineRule="exact"/>
               <w:jc w:val="center"/>
             </w:pPr>
             <w:r>
@@ -1724,7 +1716,7 @@
           </w:tcPr>
           <w:p>
             <w:pPr>
-              <w:spacing w:after="40" w:before="40" w:line="283" w:lineRule="auto"/>
+              <w:spacing w:after="40" w:before="40" w:line="260" w:lineRule="exact"/>
               <w:jc w:val="left"/>
             </w:pPr>
             <w:r>
@@ -1755,7 +1747,7 @@
           </w:tcPr>
           <w:p>
             <w:pPr>
-              <w:spacing w:after="40" w:before="40" w:line="283" w:lineRule="auto"/>
+              <w:spacing w:after="40" w:before="40" w:line="260" w:lineRule="exact"/>
               <w:jc w:val="left"/>
             </w:pPr>
             <w:r>
@@ -1786,7 +1778,7 @@
           </w:tcPr>
           <w:p>
             <w:pPr>
-              <w:spacing w:after="40" w:before="40" w:line="283" w:lineRule="auto"/>
+              <w:spacing w:after="40" w:before="40" w:line="260" w:lineRule="exact"/>
               <w:jc w:val="left"/>
             </w:pPr>
             <w:r>
@@ -1822,7 +1814,7 @@
           </w:tcPr>
           <w:p>
             <w:pPr>
-              <w:spacing w:after="40" w:before="40" w:line="283" w:lineRule="auto"/>
+              <w:spacing w:after="40" w:before="40" w:line="260" w:lineRule="exact"/>
               <w:jc w:val="center"/>
             </w:pPr>
             <w:r>
@@ -1853,7 +1845,7 @@
           </w:tcPr>
           <w:p>
             <w:pPr>
-              <w:spacing w:after="40" w:before="40" w:line="283" w:lineRule="auto"/>
+              <w:spacing w:after="40" w:before="40" w:line="260" w:lineRule="exact"/>
               <w:jc w:val="left"/>
             </w:pPr>
             <w:r>
@@ -1884,7 +1876,7 @@
           </w:tcPr>
           <w:p>
             <w:pPr>
-              <w:spacing w:after="40" w:before="40" w:line="283" w:lineRule="auto"/>
+              <w:spacing w:after="40" w:before="40" w:line="260" w:lineRule="exact"/>
               <w:jc w:val="left"/>
             </w:pPr>
             <w:r>
@@ -1915,7 +1907,7 @@
           </w:tcPr>
           <w:p>
             <w:pPr>
-              <w:spacing w:after="40" w:before="40" w:line="283" w:lineRule="auto"/>
+              <w:spacing w:after="40" w:before="40" w:line="260" w:lineRule="exact"/>
               <w:jc w:val="left"/>
             </w:pPr>
             <w:r>
@@ -1951,7 +1943,7 @@
           </w:tcPr>
           <w:p>
             <w:pPr>
-              <w:spacing w:after="40" w:before="40" w:line="283" w:lineRule="auto"/>
+              <w:spacing w:after="40" w:before="40" w:line="260" w:lineRule="exact"/>
               <w:jc w:val="center"/>
             </w:pPr>
             <w:r>
@@ -1982,7 +1974,7 @@
           </w:tcPr>
           <w:p>
             <w:pPr>
-              <w:spacing w:after="40" w:before="40" w:line="283" w:lineRule="auto"/>
+              <w:spacing w:after="40" w:before="40" w:line="260" w:lineRule="exact"/>
               <w:jc w:val="left"/>
             </w:pPr>
             <w:r>
@@ -2013,7 +2005,7 @@
           </w:tcPr>
           <w:p>
             <w:pPr>
-              <w:spacing w:after="40" w:before="40" w:line="283" w:lineRule="auto"/>
+              <w:spacing w:after="40" w:before="40" w:line="260" w:lineRule="exact"/>
               <w:jc w:val="left"/>
             </w:pPr>
             <w:r>
@@ -2044,7 +2036,7 @@
           </w:tcPr>
           <w:p>
             <w:pPr>
-              <w:spacing w:after="40" w:before="40" w:line="283" w:lineRule="auto"/>
+              <w:spacing w:after="40" w:before="40" w:line="260" w:lineRule="exact"/>
               <w:jc w:val="left"/>
             </w:pPr>
             <w:r>
@@ -2118,13 +2110,9 @@
       </w:r>
     </w:p>
     <w:p>
-      <w:r>
-        <w:br w:type="page"/>
-      </w:r>
-    </w:p>
-    <w:p>
       <w:pPr>
         <w:pStyle w:val="Heading1"/>
+        <w:pageBreakBefore/>
       </w:pPr>
       <w:r>
         <w:t>2 추천 기능의 단계별 개발 계획</w:t>
@@ -2175,7 +2163,7 @@
           </w:tcPr>
           <w:p>
             <w:pPr>
-              <w:spacing w:after="40" w:before="40" w:line="283" w:lineRule="auto"/>
+              <w:spacing w:after="40" w:before="40" w:line="260" w:lineRule="exact"/>
               <w:jc w:val="center"/>
             </w:pPr>
             <w:r>
@@ -2207,7 +2195,7 @@
           </w:tcPr>
           <w:p>
             <w:pPr>
-              <w:spacing w:after="40" w:before="40" w:line="283" w:lineRule="auto"/>
+              <w:spacing w:after="40" w:before="40" w:line="260" w:lineRule="exact"/>
               <w:jc w:val="center"/>
             </w:pPr>
             <w:r>
@@ -2239,7 +2227,7 @@
           </w:tcPr>
           <w:p>
             <w:pPr>
-              <w:spacing w:after="40" w:before="40" w:line="283" w:lineRule="auto"/>
+              <w:spacing w:after="40" w:before="40" w:line="260" w:lineRule="exact"/>
               <w:jc w:val="center"/>
             </w:pPr>
             <w:r>
@@ -2275,7 +2263,7 @@
           </w:tcPr>
           <w:p>
             <w:pPr>
-              <w:spacing w:after="40" w:before="40" w:line="283" w:lineRule="auto"/>
+              <w:spacing w:after="40" w:before="40" w:line="260" w:lineRule="exact"/>
               <w:jc w:val="center"/>
             </w:pPr>
             <w:r>
@@ -2306,7 +2294,7 @@
           </w:tcPr>
           <w:p>
             <w:pPr>
-              <w:spacing w:after="40" w:before="40" w:line="283" w:lineRule="auto"/>
+              <w:spacing w:after="40" w:before="40" w:line="260" w:lineRule="exact"/>
               <w:jc w:val="left"/>
             </w:pPr>
             <w:r>
@@ -2337,7 +2325,7 @@
           </w:tcPr>
           <w:p>
             <w:pPr>
-              <w:spacing w:after="40" w:before="40" w:line="283" w:lineRule="auto"/>
+              <w:spacing w:after="40" w:before="40" w:line="260" w:lineRule="exact"/>
               <w:jc w:val="left"/>
             </w:pPr>
             <w:r>
@@ -2373,7 +2361,7 @@
           </w:tcPr>
           <w:p>
             <w:pPr>
-              <w:spacing w:after="40" w:before="40" w:line="283" w:lineRule="auto"/>
+              <w:spacing w:after="40" w:before="40" w:line="260" w:lineRule="exact"/>
               <w:jc w:val="center"/>
             </w:pPr>
             <w:r>
@@ -2404,7 +2392,7 @@
           </w:tcPr>
           <w:p>
             <w:pPr>
-              <w:spacing w:after="40" w:before="40" w:line="283" w:lineRule="auto"/>
+              <w:spacing w:after="40" w:before="40" w:line="260" w:lineRule="exact"/>
               <w:jc w:val="left"/>
             </w:pPr>
             <w:r>
@@ -2435,7 +2423,7 @@
           </w:tcPr>
           <w:p>
             <w:pPr>
-              <w:spacing w:after="40" w:before="40" w:line="283" w:lineRule="auto"/>
+              <w:spacing w:after="40" w:before="40" w:line="260" w:lineRule="exact"/>
               <w:jc w:val="left"/>
             </w:pPr>
             <w:r>
@@ -2471,7 +2459,7 @@
           </w:tcPr>
           <w:p>
             <w:pPr>
-              <w:spacing w:after="40" w:before="40" w:line="283" w:lineRule="auto"/>
+              <w:spacing w:after="40" w:before="40" w:line="260" w:lineRule="exact"/>
               <w:jc w:val="center"/>
             </w:pPr>
             <w:r>
@@ -2502,7 +2490,7 @@
           </w:tcPr>
           <w:p>
             <w:pPr>
-              <w:spacing w:after="40" w:before="40" w:line="283" w:lineRule="auto"/>
+              <w:spacing w:after="40" w:before="40" w:line="260" w:lineRule="exact"/>
               <w:jc w:val="left"/>
             </w:pPr>
             <w:r>
@@ -2533,7 +2521,7 @@
           </w:tcPr>
           <w:p>
             <w:pPr>
-              <w:spacing w:after="40" w:before="40" w:line="283" w:lineRule="auto"/>
+              <w:spacing w:after="40" w:before="40" w:line="260" w:lineRule="exact"/>
               <w:jc w:val="left"/>
             </w:pPr>
             <w:r>
@@ -2618,7 +2606,7 @@
           </w:tcPr>
           <w:p>
             <w:pPr>
-              <w:spacing w:after="40" w:before="40" w:line="283" w:lineRule="auto"/>
+              <w:spacing w:after="40" w:before="40" w:line="260" w:lineRule="exact"/>
               <w:jc w:val="center"/>
             </w:pPr>
             <w:r>
@@ -2650,7 +2638,7 @@
           </w:tcPr>
           <w:p>
             <w:pPr>
-              <w:spacing w:after="40" w:before="40" w:line="283" w:lineRule="auto"/>
+              <w:spacing w:after="40" w:before="40" w:line="260" w:lineRule="exact"/>
               <w:jc w:val="center"/>
             </w:pPr>
             <w:r>
@@ -2682,7 +2670,7 @@
           </w:tcPr>
           <w:p>
             <w:pPr>
-              <w:spacing w:after="40" w:before="40" w:line="283" w:lineRule="auto"/>
+              <w:spacing w:after="40" w:before="40" w:line="260" w:lineRule="exact"/>
               <w:jc w:val="center"/>
             </w:pPr>
             <w:r>
@@ -2714,7 +2702,7 @@
           </w:tcPr>
           <w:p>
             <w:pPr>
-              <w:spacing w:after="40" w:before="40" w:line="283" w:lineRule="auto"/>
+              <w:spacing w:after="40" w:before="40" w:line="260" w:lineRule="exact"/>
               <w:jc w:val="center"/>
             </w:pPr>
             <w:r>
@@ -2750,7 +2738,7 @@
           </w:tcPr>
           <w:p>
             <w:pPr>
-              <w:spacing w:after="40" w:before="40" w:line="283" w:lineRule="auto"/>
+              <w:spacing w:after="40" w:before="40" w:line="260" w:lineRule="exact"/>
               <w:jc w:val="center"/>
             </w:pPr>
             <w:r>
@@ -2781,7 +2769,7 @@
           </w:tcPr>
           <w:p>
             <w:pPr>
-              <w:spacing w:after="40" w:before="40" w:line="283" w:lineRule="auto"/>
+              <w:spacing w:after="40" w:before="40" w:line="260" w:lineRule="exact"/>
               <w:jc w:val="left"/>
             </w:pPr>
             <w:r>
@@ -2812,7 +2800,7 @@
           </w:tcPr>
           <w:p>
             <w:pPr>
-              <w:spacing w:after="40" w:before="40" w:line="283" w:lineRule="auto"/>
+              <w:spacing w:after="40" w:before="40" w:line="260" w:lineRule="exact"/>
               <w:jc w:val="left"/>
             </w:pPr>
             <w:r>
@@ -2843,7 +2831,7 @@
           </w:tcPr>
           <w:p>
             <w:pPr>
-              <w:spacing w:after="40" w:before="40" w:line="283" w:lineRule="auto"/>
+              <w:spacing w:after="40" w:before="40" w:line="260" w:lineRule="exact"/>
               <w:jc w:val="center"/>
             </w:pPr>
             <w:r>
@@ -2879,7 +2867,7 @@
           </w:tcPr>
           <w:p>
             <w:pPr>
-              <w:spacing w:after="40" w:before="40" w:line="283" w:lineRule="auto"/>
+              <w:spacing w:after="40" w:before="40" w:line="260" w:lineRule="exact"/>
               <w:jc w:val="center"/>
             </w:pPr>
             <w:r>
@@ -2910,7 +2898,7 @@
           </w:tcPr>
           <w:p>
             <w:pPr>
-              <w:spacing w:after="40" w:before="40" w:line="283" w:lineRule="auto"/>
+              <w:spacing w:after="40" w:before="40" w:line="260" w:lineRule="exact"/>
               <w:jc w:val="left"/>
             </w:pPr>
             <w:r>
@@ -2941,7 +2929,7 @@
           </w:tcPr>
           <w:p>
             <w:pPr>
-              <w:spacing w:after="40" w:before="40" w:line="283" w:lineRule="auto"/>
+              <w:spacing w:after="40" w:before="40" w:line="260" w:lineRule="exact"/>
               <w:jc w:val="left"/>
             </w:pPr>
             <w:r>
@@ -2972,7 +2960,7 @@
           </w:tcPr>
           <w:p>
             <w:pPr>
-              <w:spacing w:after="40" w:before="40" w:line="283" w:lineRule="auto"/>
+              <w:spacing w:after="40" w:before="40" w:line="260" w:lineRule="exact"/>
               <w:jc w:val="center"/>
             </w:pPr>
             <w:r>
@@ -3008,7 +2996,7 @@
           </w:tcPr>
           <w:p>
             <w:pPr>
-              <w:spacing w:after="40" w:before="40" w:line="283" w:lineRule="auto"/>
+              <w:spacing w:after="40" w:before="40" w:line="260" w:lineRule="exact"/>
               <w:jc w:val="center"/>
             </w:pPr>
             <w:r>
@@ -3039,7 +3027,7 @@
           </w:tcPr>
           <w:p>
             <w:pPr>
-              <w:spacing w:after="40" w:before="40" w:line="283" w:lineRule="auto"/>
+              <w:spacing w:after="40" w:before="40" w:line="260" w:lineRule="exact"/>
               <w:jc w:val="left"/>
             </w:pPr>
             <w:r>
@@ -3070,7 +3058,7 @@
           </w:tcPr>
           <w:p>
             <w:pPr>
-              <w:spacing w:after="40" w:before="40" w:line="283" w:lineRule="auto"/>
+              <w:spacing w:after="40" w:before="40" w:line="260" w:lineRule="exact"/>
               <w:jc w:val="left"/>
             </w:pPr>
             <w:r>
@@ -3101,7 +3089,7 @@
           </w:tcPr>
           <w:p>
             <w:pPr>
-              <w:spacing w:after="40" w:before="40" w:line="283" w:lineRule="auto"/>
+              <w:spacing w:after="40" w:before="40" w:line="260" w:lineRule="exact"/>
               <w:jc w:val="center"/>
             </w:pPr>
             <w:r>
@@ -3137,7 +3125,7 @@
           </w:tcPr>
           <w:p>
             <w:pPr>
-              <w:spacing w:after="40" w:before="40" w:line="283" w:lineRule="auto"/>
+              <w:spacing w:after="40" w:before="40" w:line="260" w:lineRule="exact"/>
               <w:jc w:val="center"/>
             </w:pPr>
             <w:r>
@@ -3168,7 +3156,7 @@
           </w:tcPr>
           <w:p>
             <w:pPr>
-              <w:spacing w:after="40" w:before="40" w:line="283" w:lineRule="auto"/>
+              <w:spacing w:after="40" w:before="40" w:line="260" w:lineRule="exact"/>
               <w:jc w:val="left"/>
             </w:pPr>
             <w:r>
@@ -3199,7 +3187,7 @@
           </w:tcPr>
           <w:p>
             <w:pPr>
-              <w:spacing w:after="40" w:before="40" w:line="283" w:lineRule="auto"/>
+              <w:spacing w:after="40" w:before="40" w:line="260" w:lineRule="exact"/>
               <w:jc w:val="left"/>
             </w:pPr>
             <w:r>
@@ -3230,7 +3218,7 @@
           </w:tcPr>
           <w:p>
             <w:pPr>
-              <w:spacing w:after="40" w:before="40" w:line="283" w:lineRule="auto"/>
+              <w:spacing w:after="40" w:before="40" w:line="260" w:lineRule="exact"/>
               <w:jc w:val="center"/>
             </w:pPr>
             <w:r>
@@ -3278,13 +3266,9 @@
       </w:r>
     </w:p>
     <w:p>
-      <w:r>
-        <w:br w:type="page"/>
-      </w:r>
-    </w:p>
-    <w:p>
       <w:pPr>
         <w:pStyle w:val="Heading1"/>
+        <w:pageBreakBefore/>
       </w:pPr>
       <w:r>
         <w:t>3 아키텍처와 서비스 책임</w:t>
@@ -3303,6 +3287,7 @@
       <w:pPr>
         <w:keepNext/>
         <w:widowControl/>
+        <w:spacing w:line="240" w:lineRule="auto"/>
         <w:jc w:val="center"/>
       </w:pPr>
       <w:r>
@@ -3396,7 +3381,7 @@
           </w:tcPr>
           <w:p>
             <w:pPr>
-              <w:spacing w:after="40" w:before="40" w:line="283" w:lineRule="auto"/>
+              <w:spacing w:after="40" w:before="40" w:line="260" w:lineRule="exact"/>
               <w:jc w:val="center"/>
             </w:pPr>
             <w:r>
@@ -3428,7 +3413,7 @@
           </w:tcPr>
           <w:p>
             <w:pPr>
-              <w:spacing w:after="40" w:before="40" w:line="283" w:lineRule="auto"/>
+              <w:spacing w:after="40" w:before="40" w:line="260" w:lineRule="exact"/>
               <w:jc w:val="center"/>
             </w:pPr>
             <w:r>
@@ -3460,7 +3445,7 @@
           </w:tcPr>
           <w:p>
             <w:pPr>
-              <w:spacing w:after="40" w:before="40" w:line="283" w:lineRule="auto"/>
+              <w:spacing w:after="40" w:before="40" w:line="260" w:lineRule="exact"/>
               <w:jc w:val="center"/>
             </w:pPr>
             <w:r>
@@ -3496,7 +3481,7 @@
           </w:tcPr>
           <w:p>
             <w:pPr>
-              <w:spacing w:after="40" w:before="40" w:line="283" w:lineRule="auto"/>
+              <w:spacing w:after="40" w:before="40" w:line="260" w:lineRule="exact"/>
               <w:jc w:val="left"/>
             </w:pPr>
             <w:r>
@@ -3527,7 +3512,7 @@
           </w:tcPr>
           <w:p>
             <w:pPr>
-              <w:spacing w:after="40" w:before="40" w:line="283" w:lineRule="auto"/>
+              <w:spacing w:after="40" w:before="40" w:line="260" w:lineRule="exact"/>
               <w:jc w:val="left"/>
             </w:pPr>
             <w:r>
@@ -3558,7 +3543,7 @@
           </w:tcPr>
           <w:p>
             <w:pPr>
-              <w:spacing w:after="40" w:before="40" w:line="283" w:lineRule="auto"/>
+              <w:spacing w:after="40" w:before="40" w:line="260" w:lineRule="exact"/>
               <w:jc w:val="left"/>
             </w:pPr>
             <w:r>
@@ -3594,7 +3579,7 @@
           </w:tcPr>
           <w:p>
             <w:pPr>
-              <w:spacing w:after="40" w:before="40" w:line="283" w:lineRule="auto"/>
+              <w:spacing w:after="40" w:before="40" w:line="260" w:lineRule="exact"/>
               <w:jc w:val="left"/>
             </w:pPr>
             <w:r>
@@ -3625,7 +3610,7 @@
           </w:tcPr>
           <w:p>
             <w:pPr>
-              <w:spacing w:after="40" w:before="40" w:line="283" w:lineRule="auto"/>
+              <w:spacing w:after="40" w:before="40" w:line="260" w:lineRule="exact"/>
               <w:jc w:val="left"/>
             </w:pPr>
             <w:r>
@@ -3656,7 +3641,7 @@
           </w:tcPr>
           <w:p>
             <w:pPr>
-              <w:spacing w:after="40" w:before="40" w:line="283" w:lineRule="auto"/>
+              <w:spacing w:after="40" w:before="40" w:line="260" w:lineRule="exact"/>
               <w:jc w:val="left"/>
             </w:pPr>
             <w:r>
@@ -3692,7 +3677,7 @@
           </w:tcPr>
           <w:p>
             <w:pPr>
-              <w:spacing w:after="40" w:before="40" w:line="283" w:lineRule="auto"/>
+              <w:spacing w:after="40" w:before="40" w:line="260" w:lineRule="exact"/>
               <w:jc w:val="left"/>
             </w:pPr>
             <w:r>
@@ -3723,7 +3708,7 @@
           </w:tcPr>
           <w:p>
             <w:pPr>
-              <w:spacing w:after="40" w:before="40" w:line="283" w:lineRule="auto"/>
+              <w:spacing w:after="40" w:before="40" w:line="260" w:lineRule="exact"/>
               <w:jc w:val="left"/>
             </w:pPr>
             <w:r>
@@ -3754,7 +3739,7 @@
           </w:tcPr>
           <w:p>
             <w:pPr>
-              <w:spacing w:after="40" w:before="40" w:line="283" w:lineRule="auto"/>
+              <w:spacing w:after="40" w:before="40" w:line="260" w:lineRule="exact"/>
               <w:jc w:val="left"/>
             </w:pPr>
             <w:r>
@@ -3790,7 +3775,7 @@
           </w:tcPr>
           <w:p>
             <w:pPr>
-              <w:spacing w:after="40" w:before="40" w:line="283" w:lineRule="auto"/>
+              <w:spacing w:after="40" w:before="40" w:line="260" w:lineRule="exact"/>
               <w:jc w:val="left"/>
             </w:pPr>
             <w:r>
@@ -3821,7 +3806,7 @@
           </w:tcPr>
           <w:p>
             <w:pPr>
-              <w:spacing w:after="40" w:before="40" w:line="283" w:lineRule="auto"/>
+              <w:spacing w:after="40" w:before="40" w:line="260" w:lineRule="exact"/>
               <w:jc w:val="left"/>
             </w:pPr>
             <w:r>
@@ -3852,7 +3837,7 @@
           </w:tcPr>
           <w:p>
             <w:pPr>
-              <w:spacing w:after="40" w:before="40" w:line="283" w:lineRule="auto"/>
+              <w:spacing w:after="40" w:before="40" w:line="260" w:lineRule="exact"/>
               <w:jc w:val="left"/>
             </w:pPr>
             <w:r>
@@ -3888,7 +3873,7 @@
           </w:tcPr>
           <w:p>
             <w:pPr>
-              <w:spacing w:after="40" w:before="40" w:line="283" w:lineRule="auto"/>
+              <w:spacing w:after="40" w:before="40" w:line="260" w:lineRule="exact"/>
               <w:jc w:val="left"/>
             </w:pPr>
             <w:r>
@@ -3919,7 +3904,7 @@
           </w:tcPr>
           <w:p>
             <w:pPr>
-              <w:spacing w:after="40" w:before="40" w:line="283" w:lineRule="auto"/>
+              <w:spacing w:after="40" w:before="40" w:line="260" w:lineRule="exact"/>
               <w:jc w:val="left"/>
             </w:pPr>
             <w:r>
@@ -3950,7 +3935,7 @@
           </w:tcPr>
           <w:p>
             <w:pPr>
-              <w:spacing w:after="40" w:before="40" w:line="283" w:lineRule="auto"/>
+              <w:spacing w:after="40" w:before="40" w:line="260" w:lineRule="exact"/>
               <w:jc w:val="left"/>
             </w:pPr>
             <w:r>
@@ -3998,13 +3983,9 @@
       </w:r>
     </w:p>
     <w:p>
-      <w:r>
-        <w:br w:type="page"/>
-      </w:r>
-    </w:p>
-    <w:p>
       <w:pPr>
         <w:pStyle w:val="Heading1"/>
+        <w:pageBreakBefore/>
       </w:pPr>
       <w:r>
         <w:t>3 업무 흐름과 검증 범위</w:t>
@@ -4040,6 +4021,7 @@
       <w:pPr>
         <w:keepNext/>
         <w:widowControl/>
+        <w:spacing w:line="240" w:lineRule="auto"/>
         <w:jc w:val="center"/>
       </w:pPr>
       <w:r>
@@ -4125,7 +4107,7 @@
           </w:tcPr>
           <w:p>
             <w:pPr>
-              <w:spacing w:after="40" w:before="40" w:line="283" w:lineRule="auto"/>
+              <w:spacing w:after="40" w:before="40" w:line="260" w:lineRule="exact"/>
               <w:jc w:val="center"/>
             </w:pPr>
             <w:r>
@@ -4157,7 +4139,7 @@
           </w:tcPr>
           <w:p>
             <w:pPr>
-              <w:spacing w:after="40" w:before="40" w:line="283" w:lineRule="auto"/>
+              <w:spacing w:after="40" w:before="40" w:line="260" w:lineRule="exact"/>
               <w:jc w:val="center"/>
             </w:pPr>
             <w:r>
@@ -4189,7 +4171,7 @@
           </w:tcPr>
           <w:p>
             <w:pPr>
-              <w:spacing w:after="40" w:before="40" w:line="283" w:lineRule="auto"/>
+              <w:spacing w:after="40" w:before="40" w:line="260" w:lineRule="exact"/>
               <w:jc w:val="center"/>
             </w:pPr>
             <w:r>
@@ -4221,7 +4203,7 @@
           </w:tcPr>
           <w:p>
             <w:pPr>
-              <w:spacing w:after="40" w:before="40" w:line="283" w:lineRule="auto"/>
+              <w:spacing w:after="40" w:before="40" w:line="260" w:lineRule="exact"/>
               <w:jc w:val="center"/>
             </w:pPr>
             <w:r>
@@ -4257,7 +4239,7 @@
           </w:tcPr>
           <w:p>
             <w:pPr>
-              <w:spacing w:after="40" w:before="40" w:line="283" w:lineRule="auto"/>
+              <w:spacing w:after="40" w:before="40" w:line="260" w:lineRule="exact"/>
               <w:jc w:val="left"/>
             </w:pPr>
             <w:r>
@@ -4288,7 +4270,7 @@
           </w:tcPr>
           <w:p>
             <w:pPr>
-              <w:spacing w:after="40" w:before="40" w:line="283" w:lineRule="auto"/>
+              <w:spacing w:after="40" w:before="40" w:line="260" w:lineRule="exact"/>
               <w:jc w:val="center"/>
             </w:pPr>
             <w:r>
@@ -4319,7 +4301,7 @@
           </w:tcPr>
           <w:p>
             <w:pPr>
-              <w:spacing w:after="40" w:before="40" w:line="283" w:lineRule="auto"/>
+              <w:spacing w:after="40" w:before="40" w:line="260" w:lineRule="exact"/>
               <w:jc w:val="left"/>
             </w:pPr>
             <w:r>
@@ -4350,7 +4332,7 @@
           </w:tcPr>
           <w:p>
             <w:pPr>
-              <w:spacing w:after="40" w:before="40" w:line="283" w:lineRule="auto"/>
+              <w:spacing w:after="40" w:before="40" w:line="260" w:lineRule="exact"/>
               <w:jc w:val="left"/>
             </w:pPr>
             <w:r>
@@ -4386,7 +4368,7 @@
           </w:tcPr>
           <w:p>
             <w:pPr>
-              <w:spacing w:after="40" w:before="40" w:line="283" w:lineRule="auto"/>
+              <w:spacing w:after="40" w:before="40" w:line="260" w:lineRule="exact"/>
               <w:jc w:val="left"/>
             </w:pPr>
             <w:r>
@@ -4417,7 +4399,7 @@
           </w:tcPr>
           <w:p>
             <w:pPr>
-              <w:spacing w:after="40" w:before="40" w:line="283" w:lineRule="auto"/>
+              <w:spacing w:after="40" w:before="40" w:line="260" w:lineRule="exact"/>
               <w:jc w:val="center"/>
             </w:pPr>
             <w:r>
@@ -4448,7 +4430,7 @@
           </w:tcPr>
           <w:p>
             <w:pPr>
-              <w:spacing w:after="40" w:before="40" w:line="283" w:lineRule="auto"/>
+              <w:spacing w:after="40" w:before="40" w:line="260" w:lineRule="exact"/>
               <w:jc w:val="left"/>
             </w:pPr>
             <w:r>
@@ -4479,7 +4461,7 @@
           </w:tcPr>
           <w:p>
             <w:pPr>
-              <w:spacing w:after="40" w:before="40" w:line="283" w:lineRule="auto"/>
+              <w:spacing w:after="40" w:before="40" w:line="260" w:lineRule="exact"/>
               <w:jc w:val="left"/>
             </w:pPr>
             <w:r>
@@ -4515,7 +4497,7 @@
           </w:tcPr>
           <w:p>
             <w:pPr>
-              <w:spacing w:after="40" w:before="40" w:line="283" w:lineRule="auto"/>
+              <w:spacing w:after="40" w:before="40" w:line="260" w:lineRule="exact"/>
               <w:jc w:val="left"/>
             </w:pPr>
             <w:r>
@@ -4546,7 +4528,7 @@
           </w:tcPr>
           <w:p>
             <w:pPr>
-              <w:spacing w:after="40" w:before="40" w:line="283" w:lineRule="auto"/>
+              <w:spacing w:after="40" w:before="40" w:line="260" w:lineRule="exact"/>
               <w:jc w:val="center"/>
             </w:pPr>
             <w:r>
@@ -4577,7 +4559,7 @@
           </w:tcPr>
           <w:p>
             <w:pPr>
-              <w:spacing w:after="40" w:before="40" w:line="283" w:lineRule="auto"/>
+              <w:spacing w:after="40" w:before="40" w:line="260" w:lineRule="exact"/>
               <w:jc w:val="left"/>
             </w:pPr>
             <w:r>
@@ -4608,7 +4590,7 @@
           </w:tcPr>
           <w:p>
             <w:pPr>
-              <w:spacing w:after="40" w:before="40" w:line="283" w:lineRule="auto"/>
+              <w:spacing w:after="40" w:before="40" w:line="260" w:lineRule="exact"/>
               <w:jc w:val="left"/>
             </w:pPr>
             <w:r>
@@ -4644,7 +4626,7 @@
           </w:tcPr>
           <w:p>
             <w:pPr>
-              <w:spacing w:after="40" w:before="40" w:line="283" w:lineRule="auto"/>
+              <w:spacing w:after="40" w:before="40" w:line="260" w:lineRule="exact"/>
               <w:jc w:val="left"/>
             </w:pPr>
             <w:r>
@@ -4675,7 +4657,7 @@
           </w:tcPr>
           <w:p>
             <w:pPr>
-              <w:spacing w:after="40" w:before="40" w:line="283" w:lineRule="auto"/>
+              <w:spacing w:after="40" w:before="40" w:line="260" w:lineRule="exact"/>
               <w:jc w:val="center"/>
             </w:pPr>
             <w:r>
@@ -4706,7 +4688,7 @@
           </w:tcPr>
           <w:p>
             <w:pPr>
-              <w:spacing w:after="40" w:before="40" w:line="283" w:lineRule="auto"/>
+              <w:spacing w:after="40" w:before="40" w:line="260" w:lineRule="exact"/>
               <w:jc w:val="left"/>
             </w:pPr>
             <w:r>
@@ -4737,7 +4719,7 @@
           </w:tcPr>
           <w:p>
             <w:pPr>
-              <w:spacing w:after="40" w:before="40" w:line="283" w:lineRule="auto"/>
+              <w:spacing w:after="40" w:before="40" w:line="260" w:lineRule="exact"/>
               <w:jc w:val="left"/>
             </w:pPr>
             <w:r>
@@ -4768,13 +4750,9 @@
       </w:r>
     </w:p>
     <w:p>
-      <w:r>
-        <w:br w:type="page"/>
-      </w:r>
-    </w:p>
-    <w:p>
       <w:pPr>
         <w:pStyle w:val="Heading1"/>
+        <w:pageBreakBefore/>
       </w:pPr>
       <w:r>
         <w:t>4 트러블슈팅과 학습 내용</w:t>
@@ -4825,7 +4803,7 @@
           </w:tcPr>
           <w:p>
             <w:pPr>
-              <w:spacing w:after="40" w:before="40" w:line="283" w:lineRule="auto"/>
+              <w:spacing w:after="40" w:before="40" w:line="260" w:lineRule="exact"/>
               <w:jc w:val="center"/>
             </w:pPr>
             <w:r>
@@ -4857,7 +4835,7 @@
           </w:tcPr>
           <w:p>
             <w:pPr>
-              <w:spacing w:after="40" w:before="40" w:line="283" w:lineRule="auto"/>
+              <w:spacing w:after="40" w:before="40" w:line="260" w:lineRule="exact"/>
               <w:jc w:val="center"/>
             </w:pPr>
             <w:r>
@@ -4889,7 +4867,7 @@
           </w:tcPr>
           <w:p>
             <w:pPr>
-              <w:spacing w:after="40" w:before="40" w:line="283" w:lineRule="auto"/>
+              <w:spacing w:after="40" w:before="40" w:line="260" w:lineRule="exact"/>
               <w:jc w:val="center"/>
             </w:pPr>
             <w:r>
@@ -4925,7 +4903,7 @@
           </w:tcPr>
           <w:p>
             <w:pPr>
-              <w:spacing w:after="40" w:before="40" w:line="283" w:lineRule="auto"/>
+              <w:spacing w:after="40" w:before="40" w:line="260" w:lineRule="exact"/>
               <w:jc w:val="left"/>
             </w:pPr>
             <w:r>
@@ -4956,7 +4934,7 @@
           </w:tcPr>
           <w:p>
             <w:pPr>
-              <w:spacing w:after="40" w:before="40" w:line="283" w:lineRule="auto"/>
+              <w:spacing w:after="40" w:before="40" w:line="260" w:lineRule="exact"/>
               <w:jc w:val="left"/>
             </w:pPr>
             <w:r>
@@ -4987,7 +4965,7 @@
           </w:tcPr>
           <w:p>
             <w:pPr>
-              <w:spacing w:after="40" w:before="40" w:line="283" w:lineRule="auto"/>
+              <w:spacing w:after="40" w:before="40" w:line="260" w:lineRule="exact"/>
               <w:jc w:val="left"/>
             </w:pPr>
             <w:r>
@@ -5023,7 +5001,7 @@
           </w:tcPr>
           <w:p>
             <w:pPr>
-              <w:spacing w:after="40" w:before="40" w:line="283" w:lineRule="auto"/>
+              <w:spacing w:after="40" w:before="40" w:line="260" w:lineRule="exact"/>
               <w:jc w:val="left"/>
             </w:pPr>
             <w:r>
@@ -5054,7 +5032,7 @@
           </w:tcPr>
           <w:p>
             <w:pPr>
-              <w:spacing w:after="40" w:before="40" w:line="283" w:lineRule="auto"/>
+              <w:spacing w:after="40" w:before="40" w:line="260" w:lineRule="exact"/>
               <w:jc w:val="left"/>
             </w:pPr>
             <w:r>
@@ -5085,7 +5063,7 @@
           </w:tcPr>
           <w:p>
             <w:pPr>
-              <w:spacing w:after="40" w:before="40" w:line="283" w:lineRule="auto"/>
+              <w:spacing w:after="40" w:before="40" w:line="260" w:lineRule="exact"/>
               <w:jc w:val="left"/>
             </w:pPr>
             <w:r>
@@ -5121,7 +5099,7 @@
           </w:tcPr>
           <w:p>
             <w:pPr>
-              <w:spacing w:after="40" w:before="40" w:line="283" w:lineRule="auto"/>
+              <w:spacing w:after="40" w:before="40" w:line="260" w:lineRule="exact"/>
               <w:jc w:val="left"/>
             </w:pPr>
             <w:r>
@@ -5152,7 +5130,7 @@
           </w:tcPr>
           <w:p>
             <w:pPr>
-              <w:spacing w:after="40" w:before="40" w:line="283" w:lineRule="auto"/>
+              <w:spacing w:after="40" w:before="40" w:line="260" w:lineRule="exact"/>
               <w:jc w:val="left"/>
             </w:pPr>
             <w:r>
@@ -5183,7 +5161,7 @@
           </w:tcPr>
           <w:p>
             <w:pPr>
-              <w:spacing w:after="40" w:before="40" w:line="283" w:lineRule="auto"/>
+              <w:spacing w:after="40" w:before="40" w:line="260" w:lineRule="exact"/>
               <w:jc w:val="left"/>
             </w:pPr>
             <w:r>
@@ -5219,7 +5197,7 @@
           </w:tcPr>
           <w:p>
             <w:pPr>
-              <w:spacing w:after="40" w:before="40" w:line="283" w:lineRule="auto"/>
+              <w:spacing w:after="40" w:before="40" w:line="260" w:lineRule="exact"/>
               <w:jc w:val="left"/>
             </w:pPr>
             <w:r>
@@ -5250,7 +5228,7 @@
           </w:tcPr>
           <w:p>
             <w:pPr>
-              <w:spacing w:after="40" w:before="40" w:line="283" w:lineRule="auto"/>
+              <w:spacing w:after="40" w:before="40" w:line="260" w:lineRule="exact"/>
               <w:jc w:val="left"/>
             </w:pPr>
             <w:r>
@@ -5281,7 +5259,7 @@
           </w:tcPr>
           <w:p>
             <w:pPr>
-              <w:spacing w:after="40" w:before="40" w:line="283" w:lineRule="auto"/>
+              <w:spacing w:after="40" w:before="40" w:line="260" w:lineRule="exact"/>
               <w:jc w:val="left"/>
             </w:pPr>
             <w:r>
@@ -5317,7 +5295,7 @@
           </w:tcPr>
           <w:p>
             <w:pPr>
-              <w:spacing w:after="40" w:before="40" w:line="283" w:lineRule="auto"/>
+              <w:spacing w:after="40" w:before="40" w:line="260" w:lineRule="exact"/>
               <w:jc w:val="left"/>
             </w:pPr>
             <w:r>
@@ -5348,7 +5326,7 @@
           </w:tcPr>
           <w:p>
             <w:pPr>
-              <w:spacing w:after="40" w:before="40" w:line="283" w:lineRule="auto"/>
+              <w:spacing w:after="40" w:before="40" w:line="260" w:lineRule="exact"/>
               <w:jc w:val="left"/>
             </w:pPr>
             <w:r>
@@ -5379,7 +5357,7 @@
           </w:tcPr>
           <w:p>
             <w:pPr>
-              <w:spacing w:after="40" w:before="40" w:line="283" w:lineRule="auto"/>
+              <w:spacing w:after="40" w:before="40" w:line="260" w:lineRule="exact"/>
               <w:jc w:val="left"/>
             </w:pPr>
             <w:r>
@@ -5453,13 +5431,9 @@
       </w:r>
     </w:p>
     <w:p>
-      <w:r>
-        <w:br w:type="page"/>
-      </w:r>
-    </w:p>
-    <w:p>
       <w:pPr>
         <w:pStyle w:val="Heading1"/>
+        <w:pageBreakBefore/>
       </w:pPr>
       <w:r>
         <w:t>5 화면 구성과 업무 적용</w:t>
@@ -5477,12 +5451,13 @@
       <w:pPr>
         <w:keepNext/>
         <w:widowControl/>
+        <w:spacing w:line="240" w:lineRule="auto"/>
         <w:jc w:val="center"/>
       </w:pPr>
       <w:r>
         <w:drawing>
           <wp:inline xmlns:a="http://schemas.openxmlformats.org/drawingml/2006/main" xmlns:pic="http://schemas.openxmlformats.org/drawingml/2006/picture">
-            <wp:extent cx="5688000" cy="7009084"/>
+            <wp:extent cx="5256000" cy="6476748"/>
             <wp:docPr id="3" name="Picture 3" descr="그림 3 조별 과제의 메인 화면과 제품 주문 화면"/>
             <wp:cNvGraphicFramePr>
               <a:graphicFrameLocks noChangeAspect="1"/>
@@ -5503,7 +5478,7 @@
                   <pic:spPr>
                     <a:xfrm>
                       <a:off x="0" y="0"/>
-                      <a:ext cx="5688000" cy="7009084"/>
+                      <a:ext cx="5256000" cy="6476748"/>
                     </a:xfrm>
                     <a:prstGeom prst="rect"/>
                   </pic:spPr>
@@ -5534,13 +5509,9 @@
       </w:r>
     </w:p>
     <w:p>
-      <w:r>
-        <w:br w:type="page"/>
-      </w:r>
-    </w:p>
-    <w:p>
       <w:pPr>
         <w:pStyle w:val="Heading1"/>
+        <w:pageBreakBefore/>
       </w:pPr>
       <w:r>
         <w:t>5 화면 구성과 추천 표현</w:t>
@@ -5558,12 +5529,13 @@
       <w:pPr>
         <w:keepNext/>
         <w:widowControl/>
+        <w:spacing w:line="240" w:lineRule="auto"/>
         <w:jc w:val="center"/>
       </w:pPr>
       <w:r>
         <w:drawing>
           <wp:inline xmlns:a="http://schemas.openxmlformats.org/drawingml/2006/main" xmlns:pic="http://schemas.openxmlformats.org/drawingml/2006/picture">
-            <wp:extent cx="5688000" cy="6935690"/>
+            <wp:extent cx="5256000" cy="6408929"/>
             <wp:docPr id="4" name="Picture 4" descr="그림 4 조별 과제의 제품 등록과 추천 화면"/>
             <wp:cNvGraphicFramePr>
               <a:graphicFrameLocks noChangeAspect="1"/>
@@ -5584,7 +5556,7 @@
                   <pic:spPr>
                     <a:xfrm>
                       <a:off x="0" y="0"/>
-                      <a:ext cx="5688000" cy="6935690"/>
+                      <a:ext cx="5256000" cy="6408929"/>
                     </a:xfrm>
                     <a:prstGeom prst="rect"/>
                   </pic:spPr>
@@ -5615,13 +5587,9 @@
       </w:r>
     </w:p>
     <w:p>
-      <w:r>
-        <w:br w:type="page"/>
-      </w:r>
-    </w:p>
-    <w:p>
       <w:pPr>
         <w:pStyle w:val="Heading1"/>
+        <w:pageBreakBefore/>
       </w:pPr>
       <w:r>
         <w:t>6 사용 사례와 기대 효과</w:t>
@@ -5673,7 +5641,7 @@
           </w:tcPr>
           <w:p>
             <w:pPr>
-              <w:spacing w:after="40" w:before="40" w:line="283" w:lineRule="auto"/>
+              <w:spacing w:after="40" w:before="40" w:line="260" w:lineRule="exact"/>
               <w:jc w:val="center"/>
             </w:pPr>
             <w:r>
@@ -5705,7 +5673,7 @@
           </w:tcPr>
           <w:p>
             <w:pPr>
-              <w:spacing w:after="40" w:before="40" w:line="283" w:lineRule="auto"/>
+              <w:spacing w:after="40" w:before="40" w:line="260" w:lineRule="exact"/>
               <w:jc w:val="center"/>
             </w:pPr>
             <w:r>
@@ -5737,7 +5705,7 @@
           </w:tcPr>
           <w:p>
             <w:pPr>
-              <w:spacing w:after="40" w:before="40" w:line="283" w:lineRule="auto"/>
+              <w:spacing w:after="40" w:before="40" w:line="260" w:lineRule="exact"/>
               <w:jc w:val="center"/>
             </w:pPr>
             <w:r>
@@ -5773,7 +5741,7 @@
           </w:tcPr>
           <w:p>
             <w:pPr>
-              <w:spacing w:after="40" w:before="40" w:line="283" w:lineRule="auto"/>
+              <w:spacing w:after="40" w:before="40" w:line="260" w:lineRule="exact"/>
               <w:jc w:val="left"/>
             </w:pPr>
             <w:r>
@@ -5804,7 +5772,7 @@
           </w:tcPr>
           <w:p>
             <w:pPr>
-              <w:spacing w:after="40" w:before="40" w:line="283" w:lineRule="auto"/>
+              <w:spacing w:after="40" w:before="40" w:line="260" w:lineRule="exact"/>
               <w:jc w:val="left"/>
             </w:pPr>
             <w:r>
@@ -5835,7 +5803,7 @@
           </w:tcPr>
           <w:p>
             <w:pPr>
-              <w:spacing w:after="40" w:before="40" w:line="283" w:lineRule="auto"/>
+              <w:spacing w:after="40" w:before="40" w:line="260" w:lineRule="exact"/>
               <w:jc w:val="left"/>
             </w:pPr>
             <w:r>
@@ -5871,7 +5839,7 @@
           </w:tcPr>
           <w:p>
             <w:pPr>
-              <w:spacing w:after="40" w:before="40" w:line="283" w:lineRule="auto"/>
+              <w:spacing w:after="40" w:before="40" w:line="260" w:lineRule="exact"/>
               <w:jc w:val="left"/>
             </w:pPr>
             <w:r>
@@ -5902,7 +5870,7 @@
           </w:tcPr>
           <w:p>
             <w:pPr>
-              <w:spacing w:after="40" w:before="40" w:line="283" w:lineRule="auto"/>
+              <w:spacing w:after="40" w:before="40" w:line="260" w:lineRule="exact"/>
               <w:jc w:val="left"/>
             </w:pPr>
             <w:r>
@@ -5933,7 +5901,7 @@
           </w:tcPr>
           <w:p>
             <w:pPr>
-              <w:spacing w:after="40" w:before="40" w:line="283" w:lineRule="auto"/>
+              <w:spacing w:after="40" w:before="40" w:line="260" w:lineRule="exact"/>
               <w:jc w:val="left"/>
             </w:pPr>
             <w:r>
@@ -5969,7 +5937,7 @@
           </w:tcPr>
           <w:p>
             <w:pPr>
-              <w:spacing w:after="40" w:before="40" w:line="283" w:lineRule="auto"/>
+              <w:spacing w:after="40" w:before="40" w:line="260" w:lineRule="exact"/>
               <w:jc w:val="left"/>
             </w:pPr>
             <w:r>
@@ -6000,7 +5968,7 @@
           </w:tcPr>
           <w:p>
             <w:pPr>
-              <w:spacing w:after="40" w:before="40" w:line="283" w:lineRule="auto"/>
+              <w:spacing w:after="40" w:before="40" w:line="260" w:lineRule="exact"/>
               <w:jc w:val="left"/>
             </w:pPr>
             <w:r>
@@ -6031,7 +5999,7 @@
           </w:tcPr>
           <w:p>
             <w:pPr>
-              <w:spacing w:after="40" w:before="40" w:line="283" w:lineRule="auto"/>
+              <w:spacing w:after="40" w:before="40" w:line="260" w:lineRule="exact"/>
               <w:jc w:val="left"/>
             </w:pPr>
             <w:r>
@@ -6067,7 +6035,7 @@
           </w:tcPr>
           <w:p>
             <w:pPr>
-              <w:spacing w:after="40" w:before="40" w:line="283" w:lineRule="auto"/>
+              <w:spacing w:after="40" w:before="40" w:line="260" w:lineRule="exact"/>
               <w:jc w:val="left"/>
             </w:pPr>
             <w:r>
@@ -6098,7 +6066,7 @@
           </w:tcPr>
           <w:p>
             <w:pPr>
-              <w:spacing w:after="40" w:before="40" w:line="283" w:lineRule="auto"/>
+              <w:spacing w:after="40" w:before="40" w:line="260" w:lineRule="exact"/>
               <w:jc w:val="left"/>
             </w:pPr>
             <w:r>
@@ -6129,7 +6097,7 @@
           </w:tcPr>
           <w:p>
             <w:pPr>
-              <w:spacing w:after="40" w:before="40" w:line="283" w:lineRule="auto"/>
+              <w:spacing w:after="40" w:before="40" w:line="260" w:lineRule="exact"/>
               <w:jc w:val="left"/>
             </w:pPr>
             <w:r>
@@ -6165,7 +6133,7 @@
           </w:tcPr>
           <w:p>
             <w:pPr>
-              <w:spacing w:after="40" w:before="40" w:line="283" w:lineRule="auto"/>
+              <w:spacing w:after="40" w:before="40" w:line="260" w:lineRule="exact"/>
               <w:jc w:val="left"/>
             </w:pPr>
             <w:r>
@@ -6196,7 +6164,7 @@
           </w:tcPr>
           <w:p>
             <w:pPr>
-              <w:spacing w:after="40" w:before="40" w:line="283" w:lineRule="auto"/>
+              <w:spacing w:after="40" w:before="40" w:line="260" w:lineRule="exact"/>
               <w:jc w:val="left"/>
             </w:pPr>
             <w:r>
@@ -6227,7 +6195,7 @@
           </w:tcPr>
           <w:p>
             <w:pPr>
-              <w:spacing w:after="40" w:before="40" w:line="283" w:lineRule="auto"/>
+              <w:spacing w:after="40" w:before="40" w:line="260" w:lineRule="exact"/>
               <w:jc w:val="left"/>
             </w:pPr>
             <w:r>
@@ -6292,13 +6260,9 @@
       </w:r>
     </w:p>
     <w:p>
-      <w:r>
-        <w:br w:type="page"/>
-      </w:r>
-    </w:p>
-    <w:p>
       <w:pPr>
         <w:pStyle w:val="Heading1"/>
+        <w:pageBreakBefore/>
       </w:pPr>
       <w:r>
         <w:t>7 실제 현업 사례와 적용 아이디어</w:t>
@@ -6440,13 +6404,9 @@
       </w:r>
     </w:p>
     <w:p>
-      <w:r>
-        <w:br w:type="page"/>
-      </w:r>
-    </w:p>
-    <w:p>
       <w:pPr>
         <w:pStyle w:val="Heading1"/>
+        <w:pageBreakBefore/>
       </w:pPr>
       <w:r>
         <w:t>8 참고자료와 구현에 적용할 점</w:t>
@@ -6618,13 +6578,9 @@
       </w:hyperlink>
     </w:p>
     <w:p>
-      <w:r>
-        <w:br w:type="page"/>
-      </w:r>
-    </w:p>
-    <w:p>
       <w:pPr>
         <w:pStyle w:val="Heading1"/>
+        <w:pageBreakBefore/>
       </w:pPr>
       <w:r>
         <w:t>9 종합 결론</w:t>
@@ -6702,7 +6658,7 @@
           </w:tcPr>
           <w:p>
             <w:pPr>
-              <w:spacing w:after="40" w:before="40" w:line="283" w:lineRule="auto"/>
+              <w:spacing w:after="40" w:before="40" w:line="260" w:lineRule="exact"/>
               <w:jc w:val="center"/>
             </w:pPr>
             <w:r>
@@ -6734,7 +6690,7 @@
           </w:tcPr>
           <w:p>
             <w:pPr>
-              <w:spacing w:after="40" w:before="40" w:line="283" w:lineRule="auto"/>
+              <w:spacing w:after="40" w:before="40" w:line="260" w:lineRule="exact"/>
               <w:jc w:val="center"/>
             </w:pPr>
             <w:r>
@@ -6766,7 +6722,7 @@
           </w:tcPr>
           <w:p>
             <w:pPr>
-              <w:spacing w:after="40" w:before="40" w:line="283" w:lineRule="auto"/>
+              <w:spacing w:after="40" w:before="40" w:line="260" w:lineRule="exact"/>
               <w:jc w:val="center"/>
             </w:pPr>
             <w:r>
@@ -6802,7 +6758,7 @@
           </w:tcPr>
           <w:p>
             <w:pPr>
-              <w:spacing w:after="40" w:before="40" w:line="283" w:lineRule="auto"/>
+              <w:spacing w:after="40" w:before="40" w:line="260" w:lineRule="exact"/>
               <w:jc w:val="center"/>
             </w:pPr>
             <w:r>
@@ -6833,7 +6789,7 @@
           </w:tcPr>
           <w:p>
             <w:pPr>
-              <w:spacing w:after="40" w:before="40" w:line="283" w:lineRule="auto"/>
+              <w:spacing w:after="40" w:before="40" w:line="260" w:lineRule="exact"/>
               <w:jc w:val="left"/>
             </w:pPr>
             <w:r>
@@ -6864,7 +6820,7 @@
           </w:tcPr>
           <w:p>
             <w:pPr>
-              <w:spacing w:after="40" w:before="40" w:line="283" w:lineRule="auto"/>
+              <w:spacing w:after="40" w:before="40" w:line="260" w:lineRule="exact"/>
               <w:jc w:val="left"/>
             </w:pPr>
             <w:r>
@@ -6900,7 +6856,7 @@
           </w:tcPr>
           <w:p>
             <w:pPr>
-              <w:spacing w:after="40" w:before="40" w:line="283" w:lineRule="auto"/>
+              <w:spacing w:after="40" w:before="40" w:line="260" w:lineRule="exact"/>
               <w:jc w:val="center"/>
             </w:pPr>
             <w:r>
@@ -6931,7 +6887,7 @@
           </w:tcPr>
           <w:p>
             <w:pPr>
-              <w:spacing w:after="40" w:before="40" w:line="283" w:lineRule="auto"/>
+              <w:spacing w:after="40" w:before="40" w:line="260" w:lineRule="exact"/>
               <w:jc w:val="left"/>
             </w:pPr>
             <w:r>
@@ -6962,7 +6918,7 @@
           </w:tcPr>
           <w:p>
             <w:pPr>
-              <w:spacing w:after="40" w:before="40" w:line="283" w:lineRule="auto"/>
+              <w:spacing w:after="40" w:before="40" w:line="260" w:lineRule="exact"/>
               <w:jc w:val="left"/>
             </w:pPr>
             <w:r>
@@ -6998,7 +6954,7 @@
           </w:tcPr>
           <w:p>
             <w:pPr>
-              <w:spacing w:after="40" w:before="40" w:line="283" w:lineRule="auto"/>
+              <w:spacing w:after="40" w:before="40" w:line="260" w:lineRule="exact"/>
               <w:jc w:val="center"/>
             </w:pPr>
             <w:r>
@@ -7029,7 +6985,7 @@
           </w:tcPr>
           <w:p>
             <w:pPr>
-              <w:spacing w:after="40" w:before="40" w:line="283" w:lineRule="auto"/>
+              <w:spacing w:after="40" w:before="40" w:line="260" w:lineRule="exact"/>
               <w:jc w:val="left"/>
             </w:pPr>
             <w:r>
@@ -7060,7 +7016,7 @@
           </w:tcPr>
           <w:p>
             <w:pPr>
-              <w:spacing w:after="40" w:before="40" w:line="283" w:lineRule="auto"/>
+              <w:spacing w:after="40" w:before="40" w:line="260" w:lineRule="exact"/>
               <w:jc w:val="left"/>
             </w:pPr>
             <w:r>
@@ -7096,7 +7052,7 @@
           </w:tcPr>
           <w:p>
             <w:pPr>
-              <w:spacing w:after="40" w:before="40" w:line="283" w:lineRule="auto"/>
+              <w:spacing w:after="40" w:before="40" w:line="260" w:lineRule="exact"/>
               <w:jc w:val="center"/>
             </w:pPr>
             <w:r>
@@ -7127,7 +7083,7 @@
           </w:tcPr>
           <w:p>
             <w:pPr>
-              <w:spacing w:after="40" w:before="40" w:line="283" w:lineRule="auto"/>
+              <w:spacing w:after="40" w:before="40" w:line="260" w:lineRule="exact"/>
               <w:jc w:val="left"/>
             </w:pPr>
             <w:r>
@@ -7158,7 +7114,7 @@
           </w:tcPr>
           <w:p>
             <w:pPr>
-              <w:spacing w:after="40" w:before="40" w:line="283" w:lineRule="auto"/>
+              <w:spacing w:after="40" w:before="40" w:line="260" w:lineRule="exact"/>
               <w:jc w:val="left"/>
             </w:pPr>
             <w:r>
@@ -7613,10 +7569,10 @@
     <w:qFormat/>
     <w:rsid w:val="00FC693F"/>
     <w:pPr>
-      <w:spacing w:line="312" w:lineRule="auto" w:after="140"/>
+      <w:spacing w:line="300" w:lineRule="exact" w:after="140"/>
     </w:pPr>
     <w:rPr>
-      <w:rFonts w:ascii="Apple SD Gothic Neo" w:hAnsi="Apple SD Gothic Neo" w:eastAsia="Apple SD Gothic Neo"/>
+      <w:rFonts w:ascii="Noto Sans CJK KR" w:hAnsi="Noto Sans CJK KR" w:eastAsia="Noto Sans CJK KR" w:cs="Noto Sans CJK KR"/>
       <w:color w:val="000000"/>
       <w:sz w:val="21"/>
     </w:rPr>
@@ -7676,11 +7632,11 @@
     <w:pPr>
       <w:keepNext/>
       <w:keepLines/>
-      <w:spacing w:before="200" w:after="160" w:line="312" w:lineRule="auto"/>
+      <w:spacing w:before="200" w:after="160" w:line="440" w:lineRule="exact"/>
       <w:outlineLvl w:val="0"/>
     </w:pPr>
     <w:rPr>
-      <w:rFonts w:asciiTheme="majorHAnsi" w:eastAsiaTheme="majorEastAsia" w:hAnsiTheme="majorHAnsi" w:cstheme="majorBidi" w:ascii="Apple SD Gothic Neo" w:hAnsi="Apple SD Gothic Neo" w:eastAsia="Apple SD Gothic Neo"/>
+      <w:rFonts w:ascii="Noto Sans CJK KR" w:hAnsi="Noto Sans CJK KR" w:eastAsia="Noto Sans CJK KR" w:cs="Noto Sans CJK KR"/>
       <w:b/>
       <w:bCs/>
       <w:color w:val="000000"/>
@@ -7700,11 +7656,11 @@
     <w:pPr>
       <w:keepNext/>
       <w:keepLines/>
-      <w:spacing w:before="200" w:after="160" w:line="312" w:lineRule="auto"/>
+      <w:spacing w:before="200" w:after="160" w:line="360" w:lineRule="exact"/>
       <w:outlineLvl w:val="1"/>
     </w:pPr>
     <w:rPr>
-      <w:rFonts w:asciiTheme="majorHAnsi" w:eastAsiaTheme="majorEastAsia" w:hAnsiTheme="majorHAnsi" w:cstheme="majorBidi" w:ascii="Apple SD Gothic Neo" w:hAnsi="Apple SD Gothic Neo" w:eastAsia="Apple SD Gothic Neo"/>
+      <w:rFonts w:ascii="Noto Sans CJK KR" w:hAnsi="Noto Sans CJK KR" w:eastAsia="Noto Sans CJK KR" w:cs="Noto Sans CJK KR"/>
       <w:b/>
       <w:bCs/>
       <w:color w:val="000000"/>
@@ -7724,11 +7680,11 @@
     <w:pPr>
       <w:keepNext/>
       <w:keepLines/>
-      <w:spacing w:before="200" w:after="160" w:line="312" w:lineRule="auto"/>
+      <w:spacing w:before="200" w:after="160" w:line="360" w:lineRule="exact"/>
       <w:outlineLvl w:val="2"/>
     </w:pPr>
     <w:rPr>
-      <w:rFonts w:asciiTheme="majorHAnsi" w:eastAsiaTheme="majorEastAsia" w:hAnsiTheme="majorHAnsi" w:cstheme="majorBidi" w:ascii="Apple SD Gothic Neo" w:hAnsi="Apple SD Gothic Neo" w:eastAsia="Apple SD Gothic Neo"/>
+      <w:rFonts w:ascii="Noto Sans CJK KR" w:hAnsi="Noto Sans CJK KR" w:eastAsia="Noto Sans CJK KR" w:cs="Noto Sans CJK KR"/>
       <w:b/>
       <w:bCs/>
       <w:color w:val="000000"/>
@@ -7752,7 +7708,7 @@
       <w:outlineLvl w:val="3"/>
     </w:pPr>
     <w:rPr>
-      <w:rFonts w:asciiTheme="majorHAnsi" w:eastAsiaTheme="majorEastAsia" w:hAnsiTheme="majorHAnsi" w:cstheme="majorBidi"/>
+      <w:rFonts w:ascii="Noto Sans CJK KR" w:hAnsi="Noto Sans CJK KR" w:eastAsia="Noto Sans CJK KR" w:cs="Noto Sans CJK KR"/>
       <w:b/>
       <w:bCs/>
       <w:i/>
@@ -7777,7 +7733,7 @@
       <w:outlineLvl w:val="4"/>
     </w:pPr>
     <w:rPr>
-      <w:rFonts w:asciiTheme="majorHAnsi" w:eastAsiaTheme="majorEastAsia" w:hAnsiTheme="majorHAnsi" w:cstheme="majorBidi"/>
+      <w:rFonts w:ascii="Noto Sans CJK KR" w:hAnsi="Noto Sans CJK KR" w:eastAsia="Noto Sans CJK KR" w:cs="Noto Sans CJK KR"/>
       <w:color w:val="243F60" w:themeColor="accent1" w:themeShade="7F"/>
     </w:rPr>
   </w:style>
@@ -7798,7 +7754,7 @@
       <w:outlineLvl w:val="5"/>
     </w:pPr>
     <w:rPr>
-      <w:rFonts w:asciiTheme="majorHAnsi" w:eastAsiaTheme="majorEastAsia" w:hAnsiTheme="majorHAnsi" w:cstheme="majorBidi"/>
+      <w:rFonts w:ascii="Noto Sans CJK KR" w:hAnsi="Noto Sans CJK KR" w:eastAsia="Noto Sans CJK KR" w:cs="Noto Sans CJK KR"/>
       <w:i/>
       <w:iCs/>
       <w:color w:val="243F60" w:themeColor="accent1" w:themeShade="7F"/>
@@ -7821,7 +7777,7 @@
       <w:outlineLvl w:val="6"/>
     </w:pPr>
     <w:rPr>
-      <w:rFonts w:asciiTheme="majorHAnsi" w:eastAsiaTheme="majorEastAsia" w:hAnsiTheme="majorHAnsi" w:cstheme="majorBidi"/>
+      <w:rFonts w:ascii="Noto Sans CJK KR" w:hAnsi="Noto Sans CJK KR" w:eastAsia="Noto Sans CJK KR" w:cs="Noto Sans CJK KR"/>
       <w:i/>
       <w:iCs/>
       <w:color w:val="404040" w:themeColor="text1" w:themeTint="BF"/>
@@ -7844,7 +7800,7 @@
       <w:outlineLvl w:val="7"/>
     </w:pPr>
     <w:rPr>
-      <w:rFonts w:asciiTheme="majorHAnsi" w:eastAsiaTheme="majorEastAsia" w:hAnsiTheme="majorHAnsi" w:cstheme="majorBidi"/>
+      <w:rFonts w:ascii="Noto Sans CJK KR" w:hAnsi="Noto Sans CJK KR" w:eastAsia="Noto Sans CJK KR" w:cs="Noto Sans CJK KR"/>
       <w:color w:val="4F81BD" w:themeColor="accent1"/>
       <w:sz w:val="20"/>
       <w:szCs w:val="20"/>
@@ -7867,7 +7823,7 @@
       <w:outlineLvl w:val="8"/>
     </w:pPr>
     <w:rPr>
-      <w:rFonts w:asciiTheme="majorHAnsi" w:eastAsiaTheme="majorEastAsia" w:hAnsiTheme="majorHAnsi" w:cstheme="majorBidi"/>
+      <w:rFonts w:ascii="Noto Sans CJK KR" w:hAnsi="Noto Sans CJK KR" w:eastAsia="Noto Sans CJK KR" w:cs="Noto Sans CJK KR"/>
       <w:i/>
       <w:iCs/>
       <w:color w:val="404040" w:themeColor="text1" w:themeTint="BF"/>
@@ -7918,7 +7874,7 @@
     <w:uiPriority w:val="9"/>
     <w:rsid w:val="00FC693F"/>
     <w:rPr>
-      <w:rFonts w:asciiTheme="majorHAnsi" w:eastAsiaTheme="majorEastAsia" w:hAnsiTheme="majorHAnsi" w:cstheme="majorBidi"/>
+      <w:rFonts w:ascii="Noto Sans CJK KR" w:hAnsi="Noto Sans CJK KR" w:eastAsia="Noto Sans CJK KR" w:cs="Noto Sans CJK KR"/>
       <w:b/>
       <w:bCs/>
       <w:color w:val="365F91" w:themeColor="accent1" w:themeShade="BF"/>
@@ -7933,7 +7889,7 @@
     <w:uiPriority w:val="9"/>
     <w:rsid w:val="00FC693F"/>
     <w:rPr>
-      <w:rFonts w:asciiTheme="majorHAnsi" w:eastAsiaTheme="majorEastAsia" w:hAnsiTheme="majorHAnsi" w:cstheme="majorBidi"/>
+      <w:rFonts w:ascii="Noto Sans CJK KR" w:hAnsi="Noto Sans CJK KR" w:eastAsia="Noto Sans CJK KR" w:cs="Noto Sans CJK KR"/>
       <w:b/>
       <w:bCs/>
       <w:color w:val="4F81BD" w:themeColor="accent1"/>
@@ -7948,7 +7904,7 @@
     <w:uiPriority w:val="9"/>
     <w:rsid w:val="00FC693F"/>
     <w:rPr>
-      <w:rFonts w:asciiTheme="majorHAnsi" w:eastAsiaTheme="majorEastAsia" w:hAnsiTheme="majorHAnsi" w:cstheme="majorBidi"/>
+      <w:rFonts w:ascii="Noto Sans CJK KR" w:hAnsi="Noto Sans CJK KR" w:eastAsia="Noto Sans CJK KR" w:cs="Noto Sans CJK KR"/>
       <w:b/>
       <w:bCs/>
       <w:color w:val="4F81BD" w:themeColor="accent1"/>
@@ -7964,14 +7920,11 @@
     <w:rsid w:val="00FC693F"/>
     <w:pPr>
       <w:keepNext/>
-      <w:pBdr>
-        <w:bottom w:val="single" w:sz="8" w:space="4" w:color="4F81BD" w:themeColor="accent1"/>
-      </w:pBdr>
-      <w:spacing w:after="160" w:line="312" w:lineRule="auto" w:before="200"/>
+      <w:spacing w:after="160" w:line="660" w:lineRule="exact" w:before="200"/>
       <w:contextualSpacing/>
     </w:pPr>
     <w:rPr>
-      <w:rFonts w:asciiTheme="majorHAnsi" w:eastAsiaTheme="majorEastAsia" w:hAnsiTheme="majorHAnsi" w:cstheme="majorBidi" w:ascii="Apple SD Gothic Neo" w:hAnsi="Apple SD Gothic Neo" w:eastAsia="Apple SD Gothic Neo"/>
+      <w:rFonts w:ascii="Noto Sans CJK KR" w:hAnsi="Noto Sans CJK KR" w:eastAsia="Noto Sans CJK KR" w:cs="Noto Sans CJK KR"/>
       <w:b/>
       <w:color w:val="000000"/>
       <w:spacing w:val="5"/>
@@ -7987,7 +7940,7 @@
     <w:uiPriority w:val="10"/>
     <w:rsid w:val="00FC693F"/>
     <w:rPr>
-      <w:rFonts w:asciiTheme="majorHAnsi" w:eastAsiaTheme="majorEastAsia" w:hAnsiTheme="majorHAnsi" w:cstheme="majorBidi"/>
+      <w:rFonts w:ascii="Noto Sans CJK KR" w:hAnsi="Noto Sans CJK KR" w:eastAsia="Noto Sans CJK KR" w:cs="Noto Sans CJK KR"/>
       <w:color w:val="17365D" w:themeColor="text2" w:themeShade="BF"/>
       <w:spacing w:val="5"/>
       <w:kern w:val="28"/>
@@ -8007,11 +7960,11 @@
       <w:numPr>
         <w:ilvl w:val="1"/>
       </w:numPr>
-      <w:spacing w:line="312" w:lineRule="auto" w:after="140"/>
+      <w:spacing w:line="300" w:lineRule="exact" w:after="140"/>
     </w:pPr>
     <w:rPr>
-      <w:rFonts w:asciiTheme="majorHAnsi" w:eastAsiaTheme="majorEastAsia" w:hAnsiTheme="majorHAnsi" w:cstheme="majorBidi" w:ascii="Apple SD Gothic Neo" w:hAnsi="Apple SD Gothic Neo" w:eastAsia="Apple SD Gothic Neo"/>
-      <w:i/>
+      <w:rFonts w:ascii="Noto Sans CJK KR" w:hAnsi="Noto Sans CJK KR" w:eastAsia="Noto Sans CJK KR" w:cs="Noto Sans CJK KR"/>
+      <w:i w:val="0"/>
       <w:iCs/>
       <w:color w:val="000000"/>
       <w:spacing w:val="15"/>
@@ -8026,7 +7979,7 @@
     <w:uiPriority w:val="11"/>
     <w:rsid w:val="00FC693F"/>
     <w:rPr>
-      <w:rFonts w:asciiTheme="majorHAnsi" w:eastAsiaTheme="majorEastAsia" w:hAnsiTheme="majorHAnsi" w:cstheme="majorBidi"/>
+      <w:rFonts w:ascii="Noto Sans CJK KR" w:hAnsi="Noto Sans CJK KR" w:eastAsia="Noto Sans CJK KR" w:cs="Noto Sans CJK KR"/>
       <w:i/>
       <w:iCs/>
       <w:color w:val="4F81BD" w:themeColor="accent1"/>
@@ -8054,10 +8007,10 @@
     <w:unhideWhenUsed/>
     <w:rsid w:val="00AA1D8D"/>
     <w:pPr>
-      <w:spacing w:after="140" w:line="312" w:lineRule="auto"/>
+      <w:spacing w:after="140" w:line="300" w:lineRule="exact"/>
     </w:pPr>
     <w:rPr>
-      <w:rFonts w:ascii="Apple SD Gothic Neo" w:hAnsi="Apple SD Gothic Neo" w:eastAsia="Apple SD Gothic Neo"/>
+      <w:rFonts w:ascii="Noto Sans CJK KR" w:hAnsi="Noto Sans CJK KR" w:eastAsia="Noto Sans CJK KR" w:cs="Noto Sans CJK KR"/>
       <w:color w:val="000000"/>
       <w:sz w:val="21"/>
     </w:rPr>
@@ -8278,7 +8231,7 @@
       </w:tabs>
     </w:pPr>
     <w:rPr>
-      <w:rFonts w:ascii="Courier" w:hAnsi="Courier"/>
+      <w:rFonts w:ascii="Noto Sans CJK KR" w:hAnsi="Noto Sans CJK KR" w:eastAsia="Noto Sans CJK KR" w:cs="Noto Sans CJK KR"/>
       <w:sz w:val="20"/>
       <w:szCs w:val="20"/>
     </w:rPr>
@@ -8290,7 +8243,7 @@
     <w:uiPriority w:val="99"/>
     <w:rsid w:val="0029639D"/>
     <w:rPr>
-      <w:rFonts w:ascii="Courier" w:hAnsi="Courier"/>
+      <w:rFonts w:ascii="Noto Sans CJK KR" w:hAnsi="Noto Sans CJK KR" w:eastAsia="Noto Sans CJK KR" w:cs="Noto Sans CJK KR"/>
       <w:sz w:val="20"/>
       <w:szCs w:val="20"/>
     </w:rPr>
@@ -8329,7 +8282,7 @@
     <w:semiHidden/>
     <w:rsid w:val="00FC693F"/>
     <w:rPr>
-      <w:rFonts w:asciiTheme="majorHAnsi" w:eastAsiaTheme="majorEastAsia" w:hAnsiTheme="majorHAnsi" w:cstheme="majorBidi"/>
+      <w:rFonts w:ascii="Noto Sans CJK KR" w:hAnsi="Noto Sans CJK KR" w:eastAsia="Noto Sans CJK KR" w:cs="Noto Sans CJK KR"/>
       <w:b/>
       <w:bCs/>
       <w:i/>
@@ -8345,7 +8298,7 @@
     <w:semiHidden/>
     <w:rsid w:val="00FC693F"/>
     <w:rPr>
-      <w:rFonts w:asciiTheme="majorHAnsi" w:eastAsiaTheme="majorEastAsia" w:hAnsiTheme="majorHAnsi" w:cstheme="majorBidi"/>
+      <w:rFonts w:ascii="Noto Sans CJK KR" w:hAnsi="Noto Sans CJK KR" w:eastAsia="Noto Sans CJK KR" w:cs="Noto Sans CJK KR"/>
       <w:color w:val="243F60" w:themeColor="accent1" w:themeShade="7F"/>
     </w:rPr>
   </w:style>
@@ -8357,7 +8310,7 @@
     <w:semiHidden/>
     <w:rsid w:val="00FC693F"/>
     <w:rPr>
-      <w:rFonts w:asciiTheme="majorHAnsi" w:eastAsiaTheme="majorEastAsia" w:hAnsiTheme="majorHAnsi" w:cstheme="majorBidi"/>
+      <w:rFonts w:ascii="Noto Sans CJK KR" w:hAnsi="Noto Sans CJK KR" w:eastAsia="Noto Sans CJK KR" w:cs="Noto Sans CJK KR"/>
       <w:i/>
       <w:iCs/>
       <w:color w:val="243F60" w:themeColor="accent1" w:themeShade="7F"/>
@@ -8371,7 +8324,7 @@
     <w:semiHidden/>
     <w:rsid w:val="00FC693F"/>
     <w:rPr>
-      <w:rFonts w:asciiTheme="majorHAnsi" w:eastAsiaTheme="majorEastAsia" w:hAnsiTheme="majorHAnsi" w:cstheme="majorBidi"/>
+      <w:rFonts w:ascii="Noto Sans CJK KR" w:hAnsi="Noto Sans CJK KR" w:eastAsia="Noto Sans CJK KR" w:cs="Noto Sans CJK KR"/>
       <w:i/>
       <w:iCs/>
       <w:color w:val="404040" w:themeColor="text1" w:themeTint="BF"/>
@@ -8385,7 +8338,7 @@
     <w:semiHidden/>
     <w:rsid w:val="00FC693F"/>
     <w:rPr>
-      <w:rFonts w:asciiTheme="majorHAnsi" w:eastAsiaTheme="majorEastAsia" w:hAnsiTheme="majorHAnsi" w:cstheme="majorBidi"/>
+      <w:rFonts w:ascii="Noto Sans CJK KR" w:hAnsi="Noto Sans CJK KR" w:eastAsia="Noto Sans CJK KR" w:cs="Noto Sans CJK KR"/>
       <w:color w:val="4F81BD" w:themeColor="accent1"/>
       <w:sz w:val="20"/>
       <w:szCs w:val="20"/>
@@ -8399,7 +8352,7 @@
     <w:semiHidden/>
     <w:rsid w:val="00FC693F"/>
     <w:rPr>
-      <w:rFonts w:asciiTheme="majorHAnsi" w:eastAsiaTheme="majorEastAsia" w:hAnsiTheme="majorHAnsi" w:cstheme="majorBidi"/>
+      <w:rFonts w:ascii="Noto Sans CJK KR" w:hAnsi="Noto Sans CJK KR" w:eastAsia="Noto Sans CJK KR" w:cs="Noto Sans CJK KR"/>
       <w:i/>
       <w:iCs/>
       <w:color w:val="404040" w:themeColor="text1" w:themeTint="BF"/>
@@ -8417,10 +8370,10 @@
     <w:qFormat/>
     <w:rsid w:val="00FC693F"/>
     <w:pPr>
-      <w:spacing w:line="312" w:lineRule="auto" w:after="140"/>
+      <w:spacing w:line="300" w:lineRule="exact" w:after="140"/>
     </w:pPr>
     <w:rPr>
-      <w:rFonts w:ascii="Apple SD Gothic Neo" w:hAnsi="Apple SD Gothic Neo" w:eastAsia="Apple SD Gothic Neo"/>
+      <w:rFonts w:ascii="Noto Sans CJK KR" w:hAnsi="Noto Sans CJK KR" w:eastAsia="Noto Sans CJK KR" w:cs="Noto Sans CJK KR"/>
       <w:b/>
       <w:bCs/>
       <w:color w:val="000000"/>
@@ -8459,9 +8412,6 @@
     <w:qFormat/>
     <w:rsid w:val="00FC693F"/>
     <w:pPr>
-      <w:pBdr>
-        <w:bottom w:val="single" w:sz="4" w:space="4" w:color="4F81BD" w:themeColor="accent1"/>
-      </w:pBdr>
       <w:spacing w:before="200" w:after="280"/>
       <w:ind w:left="936" w:right="936"/>
     </w:pPr>
@@ -9989,7 +9939,7 @@
         <w:spacing w:before="0" w:after="0" w:line="240" w:lineRule="auto"/>
       </w:pPr>
       <w:rPr>
-        <w:rFonts w:asciiTheme="majorHAnsi" w:eastAsiaTheme="majorEastAsia" w:hAnsiTheme="majorHAnsi" w:cstheme="majorBidi"/>
+        <w:rFonts w:ascii="Noto Sans CJK KR" w:hAnsi="Noto Sans CJK KR" w:eastAsia="Noto Sans CJK KR" w:cs="Noto Sans CJK KR"/>
         <w:b/>
         <w:bCs/>
       </w:rPr>
@@ -10010,7 +9960,7 @@
         <w:spacing w:before="0" w:after="0" w:line="240" w:lineRule="auto"/>
       </w:pPr>
       <w:rPr>
-        <w:rFonts w:asciiTheme="majorHAnsi" w:eastAsiaTheme="majorEastAsia" w:hAnsiTheme="majorHAnsi" w:cstheme="majorBidi"/>
+        <w:rFonts w:ascii="Noto Sans CJK KR" w:hAnsi="Noto Sans CJK KR" w:eastAsia="Noto Sans CJK KR" w:cs="Noto Sans CJK KR"/>
         <w:b/>
         <w:bCs/>
       </w:rPr>
@@ -10028,14 +9978,14 @@
     </w:tblStylePr>
     <w:tblStylePr w:type="firstCol">
       <w:rPr>
-        <w:rFonts w:asciiTheme="majorHAnsi" w:eastAsiaTheme="majorEastAsia" w:hAnsiTheme="majorHAnsi" w:cstheme="majorBidi"/>
+        <w:rFonts w:ascii="Noto Sans CJK KR" w:hAnsi="Noto Sans CJK KR" w:eastAsia="Noto Sans CJK KR" w:cs="Noto Sans CJK KR"/>
         <w:b/>
         <w:bCs/>
       </w:rPr>
     </w:tblStylePr>
     <w:tblStylePr w:type="lastCol">
       <w:rPr>
-        <w:rFonts w:asciiTheme="majorHAnsi" w:eastAsiaTheme="majorEastAsia" w:hAnsiTheme="majorHAnsi" w:cstheme="majorBidi"/>
+        <w:rFonts w:ascii="Noto Sans CJK KR" w:hAnsi="Noto Sans CJK KR" w:eastAsia="Noto Sans CJK KR" w:cs="Noto Sans CJK KR"/>
         <w:b/>
         <w:bCs/>
       </w:rPr>
@@ -10119,7 +10069,7 @@
         <w:spacing w:before="0" w:after="0" w:line="240" w:lineRule="auto"/>
       </w:pPr>
       <w:rPr>
-        <w:rFonts w:asciiTheme="majorHAnsi" w:eastAsiaTheme="majorEastAsia" w:hAnsiTheme="majorHAnsi" w:cstheme="majorBidi"/>
+        <w:rFonts w:ascii="Noto Sans CJK KR" w:hAnsi="Noto Sans CJK KR" w:eastAsia="Noto Sans CJK KR" w:cs="Noto Sans CJK KR"/>
         <w:b/>
         <w:bCs/>
       </w:rPr>
@@ -10140,7 +10090,7 @@
         <w:spacing w:before="0" w:after="0" w:line="240" w:lineRule="auto"/>
       </w:pPr>
       <w:rPr>
-        <w:rFonts w:asciiTheme="majorHAnsi" w:eastAsiaTheme="majorEastAsia" w:hAnsiTheme="majorHAnsi" w:cstheme="majorBidi"/>
+        <w:rFonts w:ascii="Noto Sans CJK KR" w:hAnsi="Noto Sans CJK KR" w:eastAsia="Noto Sans CJK KR" w:cs="Noto Sans CJK KR"/>
         <w:b/>
         <w:bCs/>
       </w:rPr>
@@ -10158,14 +10108,14 @@
     </w:tblStylePr>
     <w:tblStylePr w:type="firstCol">
       <w:rPr>
-        <w:rFonts w:asciiTheme="majorHAnsi" w:eastAsiaTheme="majorEastAsia" w:hAnsiTheme="majorHAnsi" w:cstheme="majorBidi"/>
+        <w:rFonts w:ascii="Noto Sans CJK KR" w:hAnsi="Noto Sans CJK KR" w:eastAsia="Noto Sans CJK KR" w:cs="Noto Sans CJK KR"/>
         <w:b/>
         <w:bCs/>
       </w:rPr>
     </w:tblStylePr>
     <w:tblStylePr w:type="lastCol">
       <w:rPr>
-        <w:rFonts w:asciiTheme="majorHAnsi" w:eastAsiaTheme="majorEastAsia" w:hAnsiTheme="majorHAnsi" w:cstheme="majorBidi"/>
+        <w:rFonts w:ascii="Noto Sans CJK KR" w:hAnsi="Noto Sans CJK KR" w:eastAsia="Noto Sans CJK KR" w:cs="Noto Sans CJK KR"/>
         <w:b/>
         <w:bCs/>
       </w:rPr>
@@ -10249,7 +10199,7 @@
         <w:spacing w:before="0" w:after="0" w:line="240" w:lineRule="auto"/>
       </w:pPr>
       <w:rPr>
-        <w:rFonts w:asciiTheme="majorHAnsi" w:eastAsiaTheme="majorEastAsia" w:hAnsiTheme="majorHAnsi" w:cstheme="majorBidi"/>
+        <w:rFonts w:ascii="Noto Sans CJK KR" w:hAnsi="Noto Sans CJK KR" w:eastAsia="Noto Sans CJK KR" w:cs="Noto Sans CJK KR"/>
         <w:b/>
         <w:bCs/>
       </w:rPr>
@@ -10270,7 +10220,7 @@
         <w:spacing w:before="0" w:after="0" w:line="240" w:lineRule="auto"/>
       </w:pPr>
       <w:rPr>
-        <w:rFonts w:asciiTheme="majorHAnsi" w:eastAsiaTheme="majorEastAsia" w:hAnsiTheme="majorHAnsi" w:cstheme="majorBidi"/>
+        <w:rFonts w:ascii="Noto Sans CJK KR" w:hAnsi="Noto Sans CJK KR" w:eastAsia="Noto Sans CJK KR" w:cs="Noto Sans CJK KR"/>
         <w:b/>
         <w:bCs/>
       </w:rPr>
@@ -10288,14 +10238,14 @@
     </w:tblStylePr>
     <w:tblStylePr w:type="firstCol">
       <w:rPr>
-        <w:rFonts w:asciiTheme="majorHAnsi" w:eastAsiaTheme="majorEastAsia" w:hAnsiTheme="majorHAnsi" w:cstheme="majorBidi"/>
+        <w:rFonts w:ascii="Noto Sans CJK KR" w:hAnsi="Noto Sans CJK KR" w:eastAsia="Noto Sans CJK KR" w:cs="Noto Sans CJK KR"/>
         <w:b/>
         <w:bCs/>
       </w:rPr>
     </w:tblStylePr>
     <w:tblStylePr w:type="lastCol">
       <w:rPr>
-        <w:rFonts w:asciiTheme="majorHAnsi" w:eastAsiaTheme="majorEastAsia" w:hAnsiTheme="majorHAnsi" w:cstheme="majorBidi"/>
+        <w:rFonts w:ascii="Noto Sans CJK KR" w:hAnsi="Noto Sans CJK KR" w:eastAsia="Noto Sans CJK KR" w:cs="Noto Sans CJK KR"/>
         <w:b/>
         <w:bCs/>
       </w:rPr>
@@ -10379,7 +10329,7 @@
         <w:spacing w:before="0" w:after="0" w:line="240" w:lineRule="auto"/>
       </w:pPr>
       <w:rPr>
-        <w:rFonts w:asciiTheme="majorHAnsi" w:eastAsiaTheme="majorEastAsia" w:hAnsiTheme="majorHAnsi" w:cstheme="majorBidi"/>
+        <w:rFonts w:ascii="Noto Sans CJK KR" w:hAnsi="Noto Sans CJK KR" w:eastAsia="Noto Sans CJK KR" w:cs="Noto Sans CJK KR"/>
         <w:b/>
         <w:bCs/>
       </w:rPr>
@@ -10400,7 +10350,7 @@
         <w:spacing w:before="0" w:after="0" w:line="240" w:lineRule="auto"/>
       </w:pPr>
       <w:rPr>
-        <w:rFonts w:asciiTheme="majorHAnsi" w:eastAsiaTheme="majorEastAsia" w:hAnsiTheme="majorHAnsi" w:cstheme="majorBidi"/>
+        <w:rFonts w:ascii="Noto Sans CJK KR" w:hAnsi="Noto Sans CJK KR" w:eastAsia="Noto Sans CJK KR" w:cs="Noto Sans CJK KR"/>
         <w:b/>
         <w:bCs/>
       </w:rPr>
@@ -10418,14 +10368,14 @@
     </w:tblStylePr>
     <w:tblStylePr w:type="firstCol">
       <w:rPr>
-        <w:rFonts w:asciiTheme="majorHAnsi" w:eastAsiaTheme="majorEastAsia" w:hAnsiTheme="majorHAnsi" w:cstheme="majorBidi"/>
+        <w:rFonts w:ascii="Noto Sans CJK KR" w:hAnsi="Noto Sans CJK KR" w:eastAsia="Noto Sans CJK KR" w:cs="Noto Sans CJK KR"/>
         <w:b/>
         <w:bCs/>
       </w:rPr>
     </w:tblStylePr>
     <w:tblStylePr w:type="lastCol">
       <w:rPr>
-        <w:rFonts w:asciiTheme="majorHAnsi" w:eastAsiaTheme="majorEastAsia" w:hAnsiTheme="majorHAnsi" w:cstheme="majorBidi"/>
+        <w:rFonts w:ascii="Noto Sans CJK KR" w:hAnsi="Noto Sans CJK KR" w:eastAsia="Noto Sans CJK KR" w:cs="Noto Sans CJK KR"/>
         <w:b/>
         <w:bCs/>
       </w:rPr>
@@ -10509,7 +10459,7 @@
         <w:spacing w:before="0" w:after="0" w:line="240" w:lineRule="auto"/>
       </w:pPr>
       <w:rPr>
-        <w:rFonts w:asciiTheme="majorHAnsi" w:eastAsiaTheme="majorEastAsia" w:hAnsiTheme="majorHAnsi" w:cstheme="majorBidi"/>
+        <w:rFonts w:ascii="Noto Sans CJK KR" w:hAnsi="Noto Sans CJK KR" w:eastAsia="Noto Sans CJK KR" w:cs="Noto Sans CJK KR"/>
         <w:b/>
         <w:bCs/>
       </w:rPr>
@@ -10530,7 +10480,7 @@
         <w:spacing w:before="0" w:after="0" w:line="240" w:lineRule="auto"/>
       </w:pPr>
       <w:rPr>
-        <w:rFonts w:asciiTheme="majorHAnsi" w:eastAsiaTheme="majorEastAsia" w:hAnsiTheme="majorHAnsi" w:cstheme="majorBidi"/>
+        <w:rFonts w:ascii="Noto Sans CJK KR" w:hAnsi="Noto Sans CJK KR" w:eastAsia="Noto Sans CJK KR" w:cs="Noto Sans CJK KR"/>
         <w:b/>
         <w:bCs/>
       </w:rPr>
@@ -10548,14 +10498,14 @@
     </w:tblStylePr>
     <w:tblStylePr w:type="firstCol">
       <w:rPr>
-        <w:rFonts w:asciiTheme="majorHAnsi" w:eastAsiaTheme="majorEastAsia" w:hAnsiTheme="majorHAnsi" w:cstheme="majorBidi"/>
+        <w:rFonts w:ascii="Noto Sans CJK KR" w:hAnsi="Noto Sans CJK KR" w:eastAsia="Noto Sans CJK KR" w:cs="Noto Sans CJK KR"/>
         <w:b/>
         <w:bCs/>
       </w:rPr>
     </w:tblStylePr>
     <w:tblStylePr w:type="lastCol">
       <w:rPr>
-        <w:rFonts w:asciiTheme="majorHAnsi" w:eastAsiaTheme="majorEastAsia" w:hAnsiTheme="majorHAnsi" w:cstheme="majorBidi"/>
+        <w:rFonts w:ascii="Noto Sans CJK KR" w:hAnsi="Noto Sans CJK KR" w:eastAsia="Noto Sans CJK KR" w:cs="Noto Sans CJK KR"/>
         <w:b/>
         <w:bCs/>
       </w:rPr>
@@ -10639,7 +10589,7 @@
         <w:spacing w:before="0" w:after="0" w:line="240" w:lineRule="auto"/>
       </w:pPr>
       <w:rPr>
-        <w:rFonts w:asciiTheme="majorHAnsi" w:eastAsiaTheme="majorEastAsia" w:hAnsiTheme="majorHAnsi" w:cstheme="majorBidi"/>
+        <w:rFonts w:ascii="Noto Sans CJK KR" w:hAnsi="Noto Sans CJK KR" w:eastAsia="Noto Sans CJK KR" w:cs="Noto Sans CJK KR"/>
         <w:b/>
         <w:bCs/>
       </w:rPr>
@@ -10660,7 +10610,7 @@
         <w:spacing w:before="0" w:after="0" w:line="240" w:lineRule="auto"/>
       </w:pPr>
       <w:rPr>
-        <w:rFonts w:asciiTheme="majorHAnsi" w:eastAsiaTheme="majorEastAsia" w:hAnsiTheme="majorHAnsi" w:cstheme="majorBidi"/>
+        <w:rFonts w:ascii="Noto Sans CJK KR" w:hAnsi="Noto Sans CJK KR" w:eastAsia="Noto Sans CJK KR" w:cs="Noto Sans CJK KR"/>
         <w:b/>
         <w:bCs/>
       </w:rPr>
@@ -10678,14 +10628,14 @@
     </w:tblStylePr>
     <w:tblStylePr w:type="firstCol">
       <w:rPr>
-        <w:rFonts w:asciiTheme="majorHAnsi" w:eastAsiaTheme="majorEastAsia" w:hAnsiTheme="majorHAnsi" w:cstheme="majorBidi"/>
+        <w:rFonts w:ascii="Noto Sans CJK KR" w:hAnsi="Noto Sans CJK KR" w:eastAsia="Noto Sans CJK KR" w:cs="Noto Sans CJK KR"/>
         <w:b/>
         <w:bCs/>
       </w:rPr>
     </w:tblStylePr>
     <w:tblStylePr w:type="lastCol">
       <w:rPr>
-        <w:rFonts w:asciiTheme="majorHAnsi" w:eastAsiaTheme="majorEastAsia" w:hAnsiTheme="majorHAnsi" w:cstheme="majorBidi"/>
+        <w:rFonts w:ascii="Noto Sans CJK KR" w:hAnsi="Noto Sans CJK KR" w:eastAsia="Noto Sans CJK KR" w:cs="Noto Sans CJK KR"/>
         <w:b/>
         <w:bCs/>
       </w:rPr>
@@ -10769,7 +10719,7 @@
         <w:spacing w:before="0" w:after="0" w:line="240" w:lineRule="auto"/>
       </w:pPr>
       <w:rPr>
-        <w:rFonts w:asciiTheme="majorHAnsi" w:eastAsiaTheme="majorEastAsia" w:hAnsiTheme="majorHAnsi" w:cstheme="majorBidi"/>
+        <w:rFonts w:ascii="Noto Sans CJK KR" w:hAnsi="Noto Sans CJK KR" w:eastAsia="Noto Sans CJK KR" w:cs="Noto Sans CJK KR"/>
         <w:b/>
         <w:bCs/>
       </w:rPr>
@@ -10790,7 +10740,7 @@
         <w:spacing w:before="0" w:after="0" w:line="240" w:lineRule="auto"/>
       </w:pPr>
       <w:rPr>
-        <w:rFonts w:asciiTheme="majorHAnsi" w:eastAsiaTheme="majorEastAsia" w:hAnsiTheme="majorHAnsi" w:cstheme="majorBidi"/>
+        <w:rFonts w:ascii="Noto Sans CJK KR" w:hAnsi="Noto Sans CJK KR" w:eastAsia="Noto Sans CJK KR" w:cs="Noto Sans CJK KR"/>
         <w:b/>
         <w:bCs/>
       </w:rPr>
@@ -10808,14 +10758,14 @@
     </w:tblStylePr>
     <w:tblStylePr w:type="firstCol">
       <w:rPr>
-        <w:rFonts w:asciiTheme="majorHAnsi" w:eastAsiaTheme="majorEastAsia" w:hAnsiTheme="majorHAnsi" w:cstheme="majorBidi"/>
+        <w:rFonts w:ascii="Noto Sans CJK KR" w:hAnsi="Noto Sans CJK KR" w:eastAsia="Noto Sans CJK KR" w:cs="Noto Sans CJK KR"/>
         <w:b/>
         <w:bCs/>
       </w:rPr>
     </w:tblStylePr>
     <w:tblStylePr w:type="lastCol">
       <w:rPr>
-        <w:rFonts w:asciiTheme="majorHAnsi" w:eastAsiaTheme="majorEastAsia" w:hAnsiTheme="majorHAnsi" w:cstheme="majorBidi"/>
+        <w:rFonts w:ascii="Noto Sans CJK KR" w:hAnsi="Noto Sans CJK KR" w:eastAsia="Noto Sans CJK KR" w:cs="Noto Sans CJK KR"/>
         <w:b/>
         <w:bCs/>
       </w:rPr>
@@ -12680,7 +12630,7 @@
     </w:tblPr>
     <w:tblStylePr w:type="firstRow">
       <w:rPr>
-        <w:rFonts w:asciiTheme="majorHAnsi" w:eastAsiaTheme="majorEastAsia" w:hAnsiTheme="majorHAnsi" w:cstheme="majorBidi"/>
+        <w:rFonts w:ascii="Noto Sans CJK KR" w:hAnsi="Noto Sans CJK KR" w:eastAsia="Noto Sans CJK KR" w:cs="Noto Sans CJK KR"/>
       </w:rPr>
       <w:tblPr/>
       <w:tcPr>
@@ -12764,7 +12714,7 @@
     </w:tblPr>
     <w:tblStylePr w:type="firstRow">
       <w:rPr>
-        <w:rFonts w:asciiTheme="majorHAnsi" w:eastAsiaTheme="majorEastAsia" w:hAnsiTheme="majorHAnsi" w:cstheme="majorBidi"/>
+        <w:rFonts w:ascii="Noto Sans CJK KR" w:hAnsi="Noto Sans CJK KR" w:eastAsia="Noto Sans CJK KR" w:cs="Noto Sans CJK KR"/>
       </w:rPr>
       <w:tblPr/>
       <w:tcPr>
@@ -12848,7 +12798,7 @@
     </w:tblPr>
     <w:tblStylePr w:type="firstRow">
       <w:rPr>
-        <w:rFonts w:asciiTheme="majorHAnsi" w:eastAsiaTheme="majorEastAsia" w:hAnsiTheme="majorHAnsi" w:cstheme="majorBidi"/>
+        <w:rFonts w:ascii="Noto Sans CJK KR" w:hAnsi="Noto Sans CJK KR" w:eastAsia="Noto Sans CJK KR" w:cs="Noto Sans CJK KR"/>
       </w:rPr>
       <w:tblPr/>
       <w:tcPr>
@@ -12932,7 +12882,7 @@
     </w:tblPr>
     <w:tblStylePr w:type="firstRow">
       <w:rPr>
-        <w:rFonts w:asciiTheme="majorHAnsi" w:eastAsiaTheme="majorEastAsia" w:hAnsiTheme="majorHAnsi" w:cstheme="majorBidi"/>
+        <w:rFonts w:ascii="Noto Sans CJK KR" w:hAnsi="Noto Sans CJK KR" w:eastAsia="Noto Sans CJK KR" w:cs="Noto Sans CJK KR"/>
       </w:rPr>
       <w:tblPr/>
       <w:tcPr>
@@ -13016,7 +12966,7 @@
     </w:tblPr>
     <w:tblStylePr w:type="firstRow">
       <w:rPr>
-        <w:rFonts w:asciiTheme="majorHAnsi" w:eastAsiaTheme="majorEastAsia" w:hAnsiTheme="majorHAnsi" w:cstheme="majorBidi"/>
+        <w:rFonts w:ascii="Noto Sans CJK KR" w:hAnsi="Noto Sans CJK KR" w:eastAsia="Noto Sans CJK KR" w:cs="Noto Sans CJK KR"/>
       </w:rPr>
       <w:tblPr/>
       <w:tcPr>
@@ -13100,7 +13050,7 @@
     </w:tblPr>
     <w:tblStylePr w:type="firstRow">
       <w:rPr>
-        <w:rFonts w:asciiTheme="majorHAnsi" w:eastAsiaTheme="majorEastAsia" w:hAnsiTheme="majorHAnsi" w:cstheme="majorBidi"/>
+        <w:rFonts w:ascii="Noto Sans CJK KR" w:hAnsi="Noto Sans CJK KR" w:eastAsia="Noto Sans CJK KR" w:cs="Noto Sans CJK KR"/>
       </w:rPr>
       <w:tblPr/>
       <w:tcPr>
@@ -13184,7 +13134,7 @@
     </w:tblPr>
     <w:tblStylePr w:type="firstRow">
       <w:rPr>
-        <w:rFonts w:asciiTheme="majorHAnsi" w:eastAsiaTheme="majorEastAsia" w:hAnsiTheme="majorHAnsi" w:cstheme="majorBidi"/>
+        <w:rFonts w:ascii="Noto Sans CJK KR" w:hAnsi="Noto Sans CJK KR" w:eastAsia="Noto Sans CJK KR" w:cs="Noto Sans CJK KR"/>
       </w:rPr>
       <w:tblPr/>
       <w:tcPr>
@@ -13249,7 +13199,7 @@
       <w:spacing w:after="0" w:line="240" w:lineRule="auto"/>
     </w:pPr>
     <w:rPr>
-      <w:rFonts w:asciiTheme="majorHAnsi" w:eastAsiaTheme="majorEastAsia" w:hAnsiTheme="majorHAnsi" w:cstheme="majorBidi"/>
+      <w:rFonts w:ascii="Noto Sans CJK KR" w:hAnsi="Noto Sans CJK KR" w:eastAsia="Noto Sans CJK KR" w:cs="Noto Sans CJK KR"/>
       <w:color w:val="000000" w:themeColor="text1"/>
     </w:rPr>
     <w:tblPr>
@@ -13377,7 +13327,7 @@
       <w:spacing w:after="0" w:line="240" w:lineRule="auto"/>
     </w:pPr>
     <w:rPr>
-      <w:rFonts w:asciiTheme="majorHAnsi" w:eastAsiaTheme="majorEastAsia" w:hAnsiTheme="majorHAnsi" w:cstheme="majorBidi"/>
+      <w:rFonts w:ascii="Noto Sans CJK KR" w:hAnsi="Noto Sans CJK KR" w:eastAsia="Noto Sans CJK KR" w:cs="Noto Sans CJK KR"/>
       <w:color w:val="000000" w:themeColor="text1"/>
     </w:rPr>
     <w:tblPr>
@@ -13505,7 +13455,7 @@
       <w:spacing w:after="0" w:line="240" w:lineRule="auto"/>
     </w:pPr>
     <w:rPr>
-      <w:rFonts w:asciiTheme="majorHAnsi" w:eastAsiaTheme="majorEastAsia" w:hAnsiTheme="majorHAnsi" w:cstheme="majorBidi"/>
+      <w:rFonts w:ascii="Noto Sans CJK KR" w:hAnsi="Noto Sans CJK KR" w:eastAsia="Noto Sans CJK KR" w:cs="Noto Sans CJK KR"/>
       <w:color w:val="000000" w:themeColor="text1"/>
     </w:rPr>
     <w:tblPr>
@@ -13633,7 +13583,7 @@
       <w:spacing w:after="0" w:line="240" w:lineRule="auto"/>
     </w:pPr>
     <w:rPr>
-      <w:rFonts w:asciiTheme="majorHAnsi" w:eastAsiaTheme="majorEastAsia" w:hAnsiTheme="majorHAnsi" w:cstheme="majorBidi"/>
+      <w:rFonts w:ascii="Noto Sans CJK KR" w:hAnsi="Noto Sans CJK KR" w:eastAsia="Noto Sans CJK KR" w:cs="Noto Sans CJK KR"/>
       <w:color w:val="000000" w:themeColor="text1"/>
     </w:rPr>
     <w:tblPr>
@@ -13761,7 +13711,7 @@
       <w:spacing w:after="0" w:line="240" w:lineRule="auto"/>
     </w:pPr>
     <w:rPr>
-      <w:rFonts w:asciiTheme="majorHAnsi" w:eastAsiaTheme="majorEastAsia" w:hAnsiTheme="majorHAnsi" w:cstheme="majorBidi"/>
+      <w:rFonts w:ascii="Noto Sans CJK KR" w:hAnsi="Noto Sans CJK KR" w:eastAsia="Noto Sans CJK KR" w:cs="Noto Sans CJK KR"/>
       <w:color w:val="000000" w:themeColor="text1"/>
     </w:rPr>
     <w:tblPr>
@@ -13889,7 +13839,7 @@
       <w:spacing w:after="0" w:line="240" w:lineRule="auto"/>
     </w:pPr>
     <w:rPr>
-      <w:rFonts w:asciiTheme="majorHAnsi" w:eastAsiaTheme="majorEastAsia" w:hAnsiTheme="majorHAnsi" w:cstheme="majorBidi"/>
+      <w:rFonts w:ascii="Noto Sans CJK KR" w:hAnsi="Noto Sans CJK KR" w:eastAsia="Noto Sans CJK KR" w:cs="Noto Sans CJK KR"/>
       <w:color w:val="000000" w:themeColor="text1"/>
     </w:rPr>
     <w:tblPr>
@@ -14017,7 +13967,7 @@
       <w:spacing w:after="0" w:line="240" w:lineRule="auto"/>
     </w:pPr>
     <w:rPr>
-      <w:rFonts w:asciiTheme="majorHAnsi" w:eastAsiaTheme="majorEastAsia" w:hAnsiTheme="majorHAnsi" w:cstheme="majorBidi"/>
+      <w:rFonts w:ascii="Noto Sans CJK KR" w:hAnsi="Noto Sans CJK KR" w:eastAsia="Noto Sans CJK KR" w:cs="Noto Sans CJK KR"/>
       <w:color w:val="000000" w:themeColor="text1"/>
     </w:rPr>
     <w:tblPr>
@@ -14656,7 +14606,7 @@
       <w:spacing w:after="0" w:line="240" w:lineRule="auto"/>
     </w:pPr>
     <w:rPr>
-      <w:rFonts w:asciiTheme="majorHAnsi" w:eastAsiaTheme="majorEastAsia" w:hAnsiTheme="majorHAnsi" w:cstheme="majorBidi"/>
+      <w:rFonts w:ascii="Noto Sans CJK KR" w:hAnsi="Noto Sans CJK KR" w:eastAsia="Noto Sans CJK KR" w:cs="Noto Sans CJK KR"/>
       <w:color w:val="000000" w:themeColor="text1"/>
     </w:rPr>
     <w:tblPr>
@@ -14781,7 +14731,7 @@
       <w:spacing w:after="0" w:line="240" w:lineRule="auto"/>
     </w:pPr>
     <w:rPr>
-      <w:rFonts w:asciiTheme="majorHAnsi" w:eastAsiaTheme="majorEastAsia" w:hAnsiTheme="majorHAnsi" w:cstheme="majorBidi"/>
+      <w:rFonts w:ascii="Noto Sans CJK KR" w:hAnsi="Noto Sans CJK KR" w:eastAsia="Noto Sans CJK KR" w:cs="Noto Sans CJK KR"/>
       <w:color w:val="000000" w:themeColor="text1"/>
     </w:rPr>
     <w:tblPr>
@@ -14906,7 +14856,7 @@
       <w:spacing w:after="0" w:line="240" w:lineRule="auto"/>
     </w:pPr>
     <w:rPr>
-      <w:rFonts w:asciiTheme="majorHAnsi" w:eastAsiaTheme="majorEastAsia" w:hAnsiTheme="majorHAnsi" w:cstheme="majorBidi"/>
+      <w:rFonts w:ascii="Noto Sans CJK KR" w:hAnsi="Noto Sans CJK KR" w:eastAsia="Noto Sans CJK KR" w:cs="Noto Sans CJK KR"/>
       <w:color w:val="000000" w:themeColor="text1"/>
     </w:rPr>
     <w:tblPr>
@@ -15031,7 +14981,7 @@
       <w:spacing w:after="0" w:line="240" w:lineRule="auto"/>
     </w:pPr>
     <w:rPr>
-      <w:rFonts w:asciiTheme="majorHAnsi" w:eastAsiaTheme="majorEastAsia" w:hAnsiTheme="majorHAnsi" w:cstheme="majorBidi"/>
+      <w:rFonts w:ascii="Noto Sans CJK KR" w:hAnsi="Noto Sans CJK KR" w:eastAsia="Noto Sans CJK KR" w:cs="Noto Sans CJK KR"/>
       <w:color w:val="000000" w:themeColor="text1"/>
     </w:rPr>
     <w:tblPr>
@@ -15156,7 +15106,7 @@
       <w:spacing w:after="0" w:line="240" w:lineRule="auto"/>
     </w:pPr>
     <w:rPr>
-      <w:rFonts w:asciiTheme="majorHAnsi" w:eastAsiaTheme="majorEastAsia" w:hAnsiTheme="majorHAnsi" w:cstheme="majorBidi"/>
+      <w:rFonts w:ascii="Noto Sans CJK KR" w:hAnsi="Noto Sans CJK KR" w:eastAsia="Noto Sans CJK KR" w:cs="Noto Sans CJK KR"/>
       <w:color w:val="000000" w:themeColor="text1"/>
     </w:rPr>
     <w:tblPr>
@@ -15281,7 +15231,7 @@
       <w:spacing w:after="0" w:line="240" w:lineRule="auto"/>
     </w:pPr>
     <w:rPr>
-      <w:rFonts w:asciiTheme="majorHAnsi" w:eastAsiaTheme="majorEastAsia" w:hAnsiTheme="majorHAnsi" w:cstheme="majorBidi"/>
+      <w:rFonts w:ascii="Noto Sans CJK KR" w:hAnsi="Noto Sans CJK KR" w:eastAsia="Noto Sans CJK KR" w:cs="Noto Sans CJK KR"/>
       <w:color w:val="000000" w:themeColor="text1"/>
     </w:rPr>
     <w:tblPr>
@@ -15406,7 +15356,7 @@
       <w:spacing w:after="0" w:line="240" w:lineRule="auto"/>
     </w:pPr>
     <w:rPr>
-      <w:rFonts w:asciiTheme="majorHAnsi" w:eastAsiaTheme="majorEastAsia" w:hAnsiTheme="majorHAnsi" w:cstheme="majorBidi"/>
+      <w:rFonts w:ascii="Noto Sans CJK KR" w:hAnsi="Noto Sans CJK KR" w:eastAsia="Noto Sans CJK KR" w:cs="Noto Sans CJK KR"/>
       <w:color w:val="000000" w:themeColor="text1"/>
     </w:rPr>
     <w:tblPr>

</xml_diff>